<commit_message>
Actualizacion de la semana 7
</commit_message>
<xml_diff>
--- a/3. Laboratorios/L1/Entregable 1.docx
+++ b/3. Laboratorios/L1/Entregable 1.docx
@@ -6414,6 +6414,21 @@
               </w:rPr>
               <w:t xml:space="preserve">Cartera concentrada en banca corporativa/comercial (58.3%) frente a personas (41.7%). Existe una brecha crítica en satisfacción: NPS retail de 52.57% frente a un NPS Pyme de 33.6%.</w:t>
             </w:r>
+            <w:commentRangeStart w:id="1"/>
+            <w:r>
+              <w:rPr>
+                <w:rFonts w:ascii="Times New Roman" w:cs="Times New Roman" w:eastAsia="Times New Roman" w:hAnsi="Times New Roman"/>
+                <w:rtl w:val="0"/>
+              </w:rPr>
+              <w:t xml:space="preserve"> La brecha asciende a 18.97 puntos (el NPS Pyme equivale al 64% del NPS retail) y sitúa al segmento Pyme 10.0 puntos por debajo de Banca de Empresas e Instituciones (NPS de 43.6%) (Banco BBVA Perú, 2026b, pp. 26 y 29).</w:t>
+            </w:r>
+            <w:commentRangeEnd w:id="1"/>
+            <w:r>
+              <w:rPr>
+                <w:rStyle w:val="CommentReference"/>
+              </w:rPr>
+              <w:commentReference w:id="1"/>
+            </w:r>
           </w:p>
         </w:tc>
       </w:tr>
@@ -6555,6 +6570,31 @@
           <w:rtl w:val="0"/>
         </w:rPr>
         <w:t xml:space="preserve">. Elaboración propia con base en la evaluación de los resultados financieros de Banco BBVA Perú. (2026b).</w:t>
+      </w:r>
+    </w:p>
+    <w:p>
+      <w:pPr>
+        <w:spacing w:after="160" w:lineRule="auto"/>
+        <w:ind w:left="720" w:firstLine="0"/>
+        <w:jc w:val="both"/>
+        <w:rPr>
+          <w:rFonts w:ascii="Times New Roman" w:cs="Times New Roman" w:eastAsia="Times New Roman" w:hAnsi="Times New Roman"/>
+        </w:rPr>
+      </w:pPr>
+      <w:commentRangeStart w:id="2"/>
+      <w:r>
+        <w:rPr>
+          <w:rFonts w:ascii="Times New Roman" w:cs="Times New Roman" w:eastAsia="Times New Roman" w:hAnsi="Times New Roman"/>
+          <w:rtl w:val="0"/>
+        </w:rPr>
+        <w:t>La brecha de satisfacción se operacionaliza con tres medidas: (i) la brecha absoluta entre los segmentos Retail y Pyme, de 18.97 puntos (52.57 − 33.6); (ii) la razón Pyme/Retail, de 0.64; y (iii) la distancia del segmento Pyme respecto de Banca de Empresas e Instituciones, de 10.0 puntos (43.6 − 33.6) (Banco BBVA Perú, 2026b, pp. 26 y 29). En las fuentes revisadas no se identifica un referente competitivo público para el NPS Pyme, por lo que la brecha interna es la medida verificable del dolor del segmento. Esta brecha se adopta como línea base de los objetivos OE1 y OE3 (Tabla 10), con la meta propuesta de reducirla a no más de 9.6 puntos (NPS Pyme ≥ 43.0%) en 18 meses, y constituye el punto de partida para sustentar los dolores de negocio y las iniciativas de TI de los siguientes entregables.</w:t>
+      </w:r>
+      <w:commentRangeEnd w:id="2"/>
+      <w:r>
+        <w:rPr>
+          <w:rStyle w:val="CommentReference"/>
+        </w:rPr>
+        <w:commentReference w:id="2"/>
       </w:r>
     </w:p>
     <w:p>
@@ -9178,6 +9218,21 @@
         </w:rPr>
         <w:t xml:space="preserve">Para el ciclo 2025-2029, BBVA organiza su estrategia alrededor de seis prioridades. El informe las adopta como marco corporativo y las traduce a la realidad peruana mediante descripciones operativas, indicadores candidatos y capacidades necesarias. Esta traducción es relevante porque un objetivo adquiere utilidad para la gestión de sistemas cuando puede relacionarse con procesos, información, responsables y resultados verificables (BBVA, 2025).</w:t>
       </w:r>
+      <w:commentRangeStart w:id="3"/>
+      <w:r>
+        <w:rPr>
+          <w:rFonts w:ascii="Times New Roman" w:cs="Times New Roman" w:eastAsia="Times New Roman" w:hAnsi="Times New Roman"/>
+          <w:rtl w:val="0"/>
+        </w:rPr>
+        <w:t xml:space="preserve"> Para que cada objetivo sea medible con precisión, la Tabla 10 incorpora la línea base numérica de BBVA Perú y una meta cuantitativa a 18 meses por objetivo, de modo que su avance pueda verificarse con datos públicos del banco.</w:t>
+      </w:r>
+      <w:commentRangeEnd w:id="3"/>
+      <w:r>
+        <w:rPr>
+          <w:rStyle w:val="CommentReference"/>
+        </w:rPr>
+        <w:commentReference w:id="3"/>
+      </w:r>
     </w:p>
     <w:p>
       <w:pPr>
@@ -9210,6 +9265,7 @@
           <w:iCs w:val="1"/>
         </w:rPr>
       </w:pPr>
+      <w:commentRangeStart w:id="4"/>
       <w:r>
         <w:rPr>
           <w:rFonts w:ascii="Times New Roman" w:cs="Times New Roman" w:eastAsia="Times New Roman" w:hAnsi="Times New Roman"/>
@@ -9217,13 +9273,20 @@
           <w:iCs w:val="1"/>
           <w:rtl w:val="0"/>
         </w:rPr>
-        <w:t xml:space="preserve">Objetivos estratégicos, indicadores y capacidades requeridas</w:t>
+        <w:t>Objetivos estratégicos, indicadores, línea base, metas y capacidades requeridas</w:t>
+      </w:r>
+      <w:commentRangeEnd w:id="4"/>
+      <w:r>
+        <w:rPr>
+          <w:rStyle w:val="CommentReference"/>
+        </w:rPr>
+        <w:commentReference w:id="4"/>
       </w:r>
     </w:p>
     <w:tbl>
       <w:tblPr>
         <w:tblStyle w:val="Table10"/>
-        <w:tblW w:w="8295.0" w:type="dxa"/>
+        <w:tblW w:w="8295" w:type="dxa"/>
         <w:jc w:val="left"/>
         <w:tblInd w:w="750.0" w:type="dxa"/>
         <w:tblBorders>
@@ -9238,9 +9301,11 @@
         <w:tblLook w:val="0600"/>
       </w:tblPr>
       <w:tblGrid>
-        <w:gridCol w:w="1920"/>
-        <w:gridCol w:w="2880"/>
-        <w:gridCol w:w="3495"/>
+        <w:gridCol w:w="1250"/>
+        <w:gridCol w:w="1650"/>
+        <w:gridCol w:w="1900"/>
+        <w:gridCol w:w="1900"/>
+        <w:gridCol w:w="1595"/>
         <w:tblGridChange w:id="0">
           <w:tblGrid>
             <w:gridCol w:w="1920"/>
@@ -9278,6 +9343,8 @@
                 <w:b w:val="1"/>
                 <w:bCs w:val="1"/>
                 <w:color w:val="ffffff"/>
+                <w:sz w:val="18"/>
+                <w:szCs w:val="18"/>
               </w:rPr>
             </w:pPr>
             <w:r>
@@ -9286,6 +9353,8 @@
                 <w:b w:val="1"/>
                 <w:bCs w:val="1"/>
                 <w:color w:val="ffffff"/>
+                <w:sz w:val="18"/>
+                <w:szCs w:val="18"/>
                 <w:rtl w:val="0"/>
               </w:rPr>
               <w:t xml:space="preserve">Objetivo estratégico</w:t>
@@ -9316,6 +9385,8 @@
                 <w:b w:val="1"/>
                 <w:bCs w:val="1"/>
                 <w:color w:val="ffffff"/>
+                <w:sz w:val="18"/>
+                <w:szCs w:val="18"/>
               </w:rPr>
             </w:pPr>
             <w:r>
@@ -9324,6 +9395,8 @@
                 <w:b w:val="1"/>
                 <w:bCs w:val="1"/>
                 <w:color w:val="ffffff"/>
+                <w:sz w:val="18"/>
+                <w:szCs w:val="18"/>
                 <w:rtl w:val="0"/>
               </w:rPr>
               <w:t xml:space="preserve">Descripción operativa</w:t>
@@ -9354,6 +9427,8 @@
                 <w:b w:val="1"/>
                 <w:bCs w:val="1"/>
                 <w:color w:val="ffffff"/>
+                <w:sz w:val="18"/>
+                <w:szCs w:val="18"/>
               </w:rPr>
             </w:pPr>
             <w:r>
@@ -9362,9 +9437,111 @@
                 <w:b w:val="1"/>
                 <w:bCs w:val="1"/>
                 <w:color w:val="ffffff"/>
+                <w:sz w:val="18"/>
+                <w:szCs w:val="18"/>
                 <w:rtl w:val="0"/>
               </w:rPr>
               <w:t xml:space="preserve">Indicadores candidatos y capacidades</w:t>
+            </w:r>
+          </w:p>
+        </w:tc>
+        <w:tc>
+          <w:tcPr>
+            <w:tcBorders>
+              <w:top w:color="d7dee4" w:space="0" w:sz="5" w:val="single"/>
+              <w:left w:color="000000" w:space="0" w:sz="0" w:val="nil"/>
+              <w:bottom w:color="d7dee4" w:space="0" w:sz="5" w:val="single"/>
+              <w:right w:color="d7dee4" w:space="0" w:sz="5" w:val="single"/>
+            </w:tcBorders>
+            <w:shd w:fill="004481" w:val="clear"/>
+            <w:tcMar>
+              <w:top w:w="80.0" w:type="dxa"/>
+              <w:left w:w="120.0" w:type="dxa"/>
+              <w:bottom w:w="80.0" w:type="dxa"/>
+              <w:right w:w="120.0" w:type="dxa"/>
+            </w:tcMar>
+            <w:vAlign w:val="top"/>
+          </w:tcPr>
+          <w:p>
+            <w:pPr>
+              <w:rPr>
+                <w:rFonts w:ascii="Times New Roman" w:cs="Times New Roman" w:eastAsia="Times New Roman" w:hAnsi="Times New Roman"/>
+                <w:b w:val="1"/>
+                <w:bCs w:val="1"/>
+                <w:color w:val="ffffff"/>
+                <w:sz w:val="18"/>
+                <w:szCs w:val="18"/>
+              </w:rPr>
+            </w:pPr>
+            <w:commentRangeStart w:id="5"/>
+            <w:r>
+              <w:rPr>
+                <w:rFonts w:ascii="Times New Roman" w:cs="Times New Roman" w:eastAsia="Times New Roman" w:hAnsi="Times New Roman"/>
+                <w:b w:val="1"/>
+                <w:bCs w:val="1"/>
+                <w:color w:val="ffffff"/>
+                <w:sz w:val="18"/>
+                <w:szCs w:val="18"/>
+                <w:rtl w:val="0"/>
+              </w:rPr>
+              <w:t xml:space="preserve">Línea base (BBVA Perú)</w:t>
+            </w:r>
+            <w:commentRangeEnd w:id="5"/>
+            <w:r>
+              <w:rPr>
+                <w:rStyle w:val="CommentReference"/>
+              </w:rPr>
+              <w:commentReference w:id="5"/>
+            </w:r>
+          </w:p>
+        </w:tc>
+        <w:tc>
+          <w:tcPr>
+            <w:tcBorders>
+              <w:top w:color="d7dee4" w:space="0" w:sz="5" w:val="single"/>
+              <w:left w:color="000000" w:space="0" w:sz="0" w:val="nil"/>
+              <w:bottom w:color="d7dee4" w:space="0" w:sz="5" w:val="single"/>
+              <w:right w:color="d7dee4" w:space="0" w:sz="5" w:val="single"/>
+            </w:tcBorders>
+            <w:shd w:fill="004481" w:val="clear"/>
+            <w:tcMar>
+              <w:top w:w="80.0" w:type="dxa"/>
+              <w:left w:w="120.0" w:type="dxa"/>
+              <w:bottom w:w="80.0" w:type="dxa"/>
+              <w:right w:w="120.0" w:type="dxa"/>
+            </w:tcMar>
+            <w:vAlign w:val="top"/>
+          </w:tcPr>
+          <w:p>
+            <w:pPr>
+              <w:rPr>
+                <w:rFonts w:ascii="Times New Roman" w:cs="Times New Roman" w:eastAsia="Times New Roman" w:hAnsi="Times New Roman"/>
+                <w:b w:val="1"/>
+                <w:bCs w:val="1"/>
+                <w:color w:val="ffffff"/>
+                <w:sz w:val="18"/>
+                <w:szCs w:val="18"/>
+              </w:rPr>
+            </w:pPr>
+            <w:commentRangeStart w:id="6"/>
+            <w:r>
+              <w:rPr>
+                <w:rFonts w:ascii="Times New Roman" w:cs="Times New Roman" w:eastAsia="Times New Roman" w:hAnsi="Times New Roman"/>
+                <w:b w:val="1"/>
+                <w:bCs w:val="1"/>
+                <w:color w:val="ffffff"/>
+                <w:sz w:val="18"/>
+                <w:szCs w:val="18"/>
+                <w:rtl w:val="0"/>
+              </w:rPr>
+              <w:t xml:space="preserve">Meta cuantitativa a 18 meses (propuesta)</w:t>
+            </w:r>
+            <w:commentRangeEnd w:id="6"/>
+            <w:r>
+              <w:rPr>
+                <w:rStyle w:val="CommentReference"/>
+              </w:rPr>
+              <w:commentReference w:id="6"/>
             </w:r>
           </w:p>
         </w:tc>
@@ -9398,6 +9575,8 @@
                 <w:b w:val="1"/>
                 <w:bCs w:val="1"/>
                 <w:color w:val="072146"/>
+                <w:sz w:val="18"/>
+                <w:szCs w:val="18"/>
               </w:rPr>
             </w:pPr>
             <w:r>
@@ -9406,6 +9585,8 @@
                 <w:b w:val="1"/>
                 <w:bCs w:val="1"/>
                 <w:color w:val="072146"/>
+                <w:sz w:val="18"/>
+                <w:szCs w:val="18"/>
                 <w:rtl w:val="0"/>
               </w:rPr>
               <w:t xml:space="preserve">OE1. “Incorporar radicalmente la perspectiva del cliente”</w:t>
@@ -9433,11 +9614,15 @@
               <w:spacing w:line="252.00000000000003" w:lineRule="auto"/>
               <w:rPr>
                 <w:rFonts w:ascii="Times New Roman" w:cs="Times New Roman" w:eastAsia="Times New Roman" w:hAnsi="Times New Roman"/>
-              </w:rPr>
-            </w:pPr>
-            <w:r>
-              <w:rPr>
-                <w:rFonts w:ascii="Times New Roman" w:cs="Times New Roman" w:eastAsia="Times New Roman" w:hAnsi="Times New Roman"/>
+                <w:sz w:val="18"/>
+                <w:szCs w:val="18"/>
+              </w:rPr>
+            </w:pPr>
+            <w:r>
+              <w:rPr>
+                <w:rFonts w:ascii="Times New Roman" w:cs="Times New Roman" w:eastAsia="Times New Roman" w:hAnsi="Times New Roman"/>
+                <w:sz w:val="18"/>
+                <w:szCs w:val="18"/>
                 <w:rtl w:val="0"/>
               </w:rPr>
               <w:t xml:space="preserve">Rediseñar journeys y decisiones desde las necesidades del cliente; asegurar una experiencia coherente, disponible y contextual en todos los canales.</w:t>
@@ -9465,14 +9650,106 @@
               <w:spacing w:line="252.00000000000003" w:lineRule="auto"/>
               <w:rPr>
                 <w:rFonts w:ascii="Times New Roman" w:cs="Times New Roman" w:eastAsia="Times New Roman" w:hAnsi="Times New Roman"/>
-              </w:rPr>
-            </w:pPr>
-            <w:r>
-              <w:rPr>
-                <w:rFonts w:ascii="Times New Roman" w:cs="Times New Roman" w:eastAsia="Times New Roman" w:hAnsi="Times New Roman"/>
+                <w:sz w:val="18"/>
+                <w:szCs w:val="18"/>
+              </w:rPr>
+            </w:pPr>
+            <w:r>
+              <w:rPr>
+                <w:rFonts w:ascii="Times New Roman" w:cs="Times New Roman" w:eastAsia="Times New Roman" w:hAnsi="Times New Roman"/>
+                <w:sz w:val="18"/>
+                <w:szCs w:val="18"/>
                 <w:rtl w:val="0"/>
               </w:rPr>
               <w:t xml:space="preserve">Indicadores: NPS, resolución en primer contacto, tiempo de ciclo, conversión y abandono. Capacidades: visión 360°, analítica de journeys, personalización, orquestación omnicanal y voz del cliente.</w:t>
+            </w:r>
+          </w:p>
+        </w:tc>
+        <w:tc>
+          <w:tcPr>
+            <w:tcBorders>
+              <w:top w:color="000000" w:space="0" w:sz="0" w:val="nil"/>
+              <w:left w:color="000000" w:space="0" w:sz="0" w:val="nil"/>
+              <w:bottom w:color="d7dee4" w:space="0" w:sz="5" w:val="single"/>
+              <w:right w:color="d7dee4" w:space="0" w:sz="5" w:val="single"/>
+            </w:tcBorders>
+            <w:tcMar>
+              <w:top w:w="80.0" w:type="dxa"/>
+              <w:left w:w="120.0" w:type="dxa"/>
+              <w:bottom w:w="80.0" w:type="dxa"/>
+              <w:right w:w="120.0" w:type="dxa"/>
+            </w:tcMar>
+            <w:vAlign w:val="top"/>
+          </w:tcPr>
+          <w:p>
+            <w:pPr>
+              <w:spacing w:line="252.00000000000003" w:lineRule="auto"/>
+              <w:rPr>
+                <w:rFonts w:ascii="Times New Roman" w:cs="Times New Roman" w:eastAsia="Times New Roman" w:hAnsi="Times New Roman"/>
+                <w:sz w:val="18"/>
+                <w:szCs w:val="18"/>
+              </w:rPr>
+            </w:pPr>
+            <w:commentRangeStart w:id="7"/>
+            <w:r>
+              <w:rPr>
+                <w:rFonts w:ascii="Times New Roman" w:cs="Times New Roman" w:eastAsia="Times New Roman" w:hAnsi="Times New Roman"/>
+                <w:sz w:val="18"/>
+                <w:szCs w:val="18"/>
+                <w:rtl w:val="0"/>
+              </w:rPr>
+              <w:t xml:space="preserve">NPS Retail 52.57% y NPS Pyme 33.6% en 2025; brecha de 18.97 puntos (Banco BBVA Perú, 2026b, p. 26). Resolución en primer contacto, tiempo de ciclo, conversión y abandono: NO HAY FUENTES EN INTERNET DISPONIBLES.</w:t>
+            </w:r>
+            <w:commentRangeEnd w:id="7"/>
+            <w:r>
+              <w:rPr>
+                <w:rStyle w:val="CommentReference"/>
+              </w:rPr>
+              <w:commentReference w:id="7"/>
+            </w:r>
+          </w:p>
+        </w:tc>
+        <w:tc>
+          <w:tcPr>
+            <w:tcBorders>
+              <w:top w:color="000000" w:space="0" w:sz="0" w:val="nil"/>
+              <w:left w:color="000000" w:space="0" w:sz="0" w:val="nil"/>
+              <w:bottom w:color="d7dee4" w:space="0" w:sz="5" w:val="single"/>
+              <w:right w:color="d7dee4" w:space="0" w:sz="5" w:val="single"/>
+            </w:tcBorders>
+            <w:tcMar>
+              <w:top w:w="80.0" w:type="dxa"/>
+              <w:left w:w="120.0" w:type="dxa"/>
+              <w:bottom w:w="80.0" w:type="dxa"/>
+              <w:right w:w="120.0" w:type="dxa"/>
+            </w:tcMar>
+            <w:vAlign w:val="top"/>
+          </w:tcPr>
+          <w:p>
+            <w:pPr>
+              <w:spacing w:line="252.00000000000003" w:lineRule="auto"/>
+              <w:rPr>
+                <w:rFonts w:ascii="Times New Roman" w:cs="Times New Roman" w:eastAsia="Times New Roman" w:hAnsi="Times New Roman"/>
+                <w:sz w:val="18"/>
+                <w:szCs w:val="18"/>
+              </w:rPr>
+            </w:pPr>
+            <w:commentRangeStart w:id="8"/>
+            <w:r>
+              <w:rPr>
+                <w:rFonts w:ascii="Times New Roman" w:cs="Times New Roman" w:eastAsia="Times New Roman" w:hAnsi="Times New Roman"/>
+                <w:sz w:val="18"/>
+                <w:szCs w:val="18"/>
+                <w:rtl w:val="0"/>
+              </w:rPr>
+              <w:t xml:space="preserve">NPS Pyme ≥ 43.0% a 18 meses (nivel actual de Banca de Empresas e Instituciones, 43.6%), con brecha frente a Retail ≤ 9.6 puntos, y NPS Retail ≥ 52.57%. Instrumentar los demás indicadores en los primeros 6 meses.</w:t>
+            </w:r>
+            <w:commentRangeEnd w:id="8"/>
+            <w:r>
+              <w:rPr>
+                <w:rStyle w:val="CommentReference"/>
+              </w:rPr>
+              <w:commentReference w:id="8"/>
             </w:r>
           </w:p>
         </w:tc>
@@ -9507,6 +9784,8 @@
                 <w:b w:val="1"/>
                 <w:bCs w:val="1"/>
                 <w:color w:val="072146"/>
+                <w:sz w:val="18"/>
+                <w:szCs w:val="18"/>
               </w:rPr>
             </w:pPr>
             <w:r>
@@ -9515,6 +9794,8 @@
                 <w:b w:val="1"/>
                 <w:bCs w:val="1"/>
                 <w:color w:val="072146"/>
+                <w:sz w:val="18"/>
+                <w:szCs w:val="18"/>
                 <w:rtl w:val="0"/>
               </w:rPr>
               <w:t xml:space="preserve">OE2. “Impulsar la sostenibilidad como motor de crecimiento”</w:t>
@@ -9543,11 +9824,15 @@
               <w:spacing w:line="252.00000000000003" w:lineRule="auto"/>
               <w:rPr>
                 <w:rFonts w:ascii="Times New Roman" w:cs="Times New Roman" w:eastAsia="Times New Roman" w:hAnsi="Times New Roman"/>
-              </w:rPr>
-            </w:pPr>
-            <w:r>
-              <w:rPr>
-                <w:rFonts w:ascii="Times New Roman" w:cs="Times New Roman" w:eastAsia="Times New Roman" w:hAnsi="Times New Roman"/>
+                <w:sz w:val="18"/>
+                <w:szCs w:val="18"/>
+              </w:rPr>
+            </w:pPr>
+            <w:r>
+              <w:rPr>
+                <w:rFonts w:ascii="Times New Roman" w:cs="Times New Roman" w:eastAsia="Times New Roman" w:hAnsi="Times New Roman"/>
+                <w:sz w:val="18"/>
+                <w:szCs w:val="18"/>
                 <w:rtl w:val="0"/>
               </w:rPr>
               <w:t xml:space="preserve">Integrar criterios ambientales y sociales en la propuesta, la originación, el riesgo, el asesoramiento y el seguimiento, no solo en el reporte.</w:t>
@@ -9576,14 +9861,108 @@
               <w:spacing w:line="252.00000000000003" w:lineRule="auto"/>
               <w:rPr>
                 <w:rFonts w:ascii="Times New Roman" w:cs="Times New Roman" w:eastAsia="Times New Roman" w:hAnsi="Times New Roman"/>
-              </w:rPr>
-            </w:pPr>
-            <w:r>
-              <w:rPr>
-                <w:rFonts w:ascii="Times New Roman" w:cs="Times New Roman" w:eastAsia="Times New Roman" w:hAnsi="Times New Roman"/>
+                <w:sz w:val="18"/>
+                <w:szCs w:val="18"/>
+              </w:rPr>
+            </w:pPr>
+            <w:r>
+              <w:rPr>
+                <w:rFonts w:ascii="Times New Roman" w:cs="Times New Roman" w:eastAsia="Times New Roman" w:hAnsi="Times New Roman"/>
+                <w:sz w:val="18"/>
+                <w:szCs w:val="18"/>
                 <w:rtl w:val="0"/>
               </w:rPr>
               <w:t xml:space="preserve">Indicadores: negocio sostenible movilizado, cartera elegible, tiempo de evaluación y calidad del dato ESG. Capacidades: taxonomía, trazabilidad, datos ESG, reglas de elegibilidad y reporting.</w:t>
+            </w:r>
+          </w:p>
+        </w:tc>
+        <w:tc>
+          <w:tcPr>
+            <w:tcBorders>
+              <w:top w:color="000000" w:space="0" w:sz="0" w:val="nil"/>
+              <w:left w:color="000000" w:space="0" w:sz="0" w:val="nil"/>
+              <w:bottom w:color="d7dee4" w:space="0" w:sz="5" w:val="single"/>
+              <w:right w:color="d7dee4" w:space="0" w:sz="5" w:val="single"/>
+            </w:tcBorders>
+            <w:shd w:fill="fafbfc" w:val="clear"/>
+            <w:tcMar>
+              <w:top w:w="80.0" w:type="dxa"/>
+              <w:left w:w="120.0" w:type="dxa"/>
+              <w:bottom w:w="80.0" w:type="dxa"/>
+              <w:right w:w="120.0" w:type="dxa"/>
+            </w:tcMar>
+            <w:vAlign w:val="top"/>
+          </w:tcPr>
+          <w:p>
+            <w:pPr>
+              <w:spacing w:line="252.00000000000003" w:lineRule="auto"/>
+              <w:rPr>
+                <w:rFonts w:ascii="Times New Roman" w:cs="Times New Roman" w:eastAsia="Times New Roman" w:hAnsi="Times New Roman"/>
+                <w:sz w:val="18"/>
+                <w:szCs w:val="18"/>
+              </w:rPr>
+            </w:pPr>
+            <w:commentRangeStart w:id="9"/>
+            <w:r>
+              <w:rPr>
+                <w:rFonts w:ascii="Times New Roman" w:cs="Times New Roman" w:eastAsia="Times New Roman" w:hAnsi="Times New Roman"/>
+                <w:sz w:val="18"/>
+                <w:szCs w:val="18"/>
+                <w:rtl w:val="0"/>
+              </w:rPr>
+              <w:t xml:space="preserve">Colocaciones sostenibles cercanas a S/ 16.5 mil millones y 115% de cumplimiento de la meta de facturación sostenible en 2025 (Banco BBVA Perú, 2026b); facturación sostenible movilizada de S/ 8,989 millones al 1S 2026 (Banco BBVA Perú, 2026a). Tiempo de evaluación y calidad del dato ESG: NO HAY FUENTES EN INTERNET DISPONIBLES.</w:t>
+            </w:r>
+            <w:commentRangeEnd w:id="9"/>
+            <w:r>
+              <w:rPr>
+                <w:rStyle w:val="CommentReference"/>
+              </w:rPr>
+              <w:commentReference w:id="9"/>
+            </w:r>
+          </w:p>
+        </w:tc>
+        <w:tc>
+          <w:tcPr>
+            <w:tcBorders>
+              <w:top w:color="000000" w:space="0" w:sz="0" w:val="nil"/>
+              <w:left w:color="000000" w:space="0" w:sz="0" w:val="nil"/>
+              <w:bottom w:color="d7dee4" w:space="0" w:sz="5" w:val="single"/>
+              <w:right w:color="d7dee4" w:space="0" w:sz="5" w:val="single"/>
+            </w:tcBorders>
+            <w:shd w:fill="fafbfc" w:val="clear"/>
+            <w:tcMar>
+              <w:top w:w="80.0" w:type="dxa"/>
+              <w:left w:w="120.0" w:type="dxa"/>
+              <w:bottom w:w="80.0" w:type="dxa"/>
+              <w:right w:w="120.0" w:type="dxa"/>
+            </w:tcMar>
+            <w:vAlign w:val="top"/>
+          </w:tcPr>
+          <w:p>
+            <w:pPr>
+              <w:spacing w:line="252.00000000000003" w:lineRule="auto"/>
+              <w:rPr>
+                <w:rFonts w:ascii="Times New Roman" w:cs="Times New Roman" w:eastAsia="Times New Roman" w:hAnsi="Times New Roman"/>
+                <w:sz w:val="18"/>
+                <w:szCs w:val="18"/>
+              </w:rPr>
+            </w:pPr>
+            <w:commentRangeStart w:id="10"/>
+            <w:r>
+              <w:rPr>
+                <w:rFonts w:ascii="Times New Roman" w:cs="Times New Roman" w:eastAsia="Times New Roman" w:hAnsi="Times New Roman"/>
+                <w:sz w:val="18"/>
+                <w:szCs w:val="18"/>
+                <w:rtl w:val="0"/>
+              </w:rPr>
+              <w:t xml:space="preserve">Colocaciones sostenibles ≥ S/ 20 mil millones (≈ +21%) y cumplimiento ≥ 100% de la meta anual de facturación sostenible a 18 meses. Instrumentar tiempo de evaluación y calidad del dato ESG en los primeros 6 meses.</w:t>
+            </w:r>
+            <w:commentRangeEnd w:id="10"/>
+            <w:r>
+              <w:rPr>
+                <w:rStyle w:val="CommentReference"/>
+              </w:rPr>
+              <w:commentReference w:id="10"/>
             </w:r>
           </w:p>
         </w:tc>
@@ -9617,6 +9996,8 @@
                 <w:b w:val="1"/>
                 <w:bCs w:val="1"/>
                 <w:color w:val="072146"/>
+                <w:sz w:val="18"/>
+                <w:szCs w:val="18"/>
               </w:rPr>
             </w:pPr>
             <w:r>
@@ -9625,6 +10006,8 @@
                 <w:b w:val="1"/>
                 <w:bCs w:val="1"/>
                 <w:color w:val="072146"/>
+                <w:sz w:val="18"/>
+                <w:szCs w:val="18"/>
                 <w:rtl w:val="0"/>
               </w:rPr>
               <w:t xml:space="preserve">OE3. “Crecer en todos los segmentos de empresas”</w:t>
@@ -9652,11 +10035,15 @@
               <w:spacing w:line="252.00000000000003" w:lineRule="auto"/>
               <w:rPr>
                 <w:rFonts w:ascii="Times New Roman" w:cs="Times New Roman" w:eastAsia="Times New Roman" w:hAnsi="Times New Roman"/>
-              </w:rPr>
-            </w:pPr>
-            <w:r>
-              <w:rPr>
-                <w:rFonts w:ascii="Times New Roman" w:cs="Times New Roman" w:eastAsia="Times New Roman" w:hAnsi="Times New Roman"/>
+                <w:sz w:val="18"/>
+                <w:szCs w:val="18"/>
+              </w:rPr>
+            </w:pPr>
+            <w:r>
+              <w:rPr>
+                <w:rFonts w:ascii="Times New Roman" w:cs="Times New Roman" w:eastAsia="Times New Roman" w:hAnsi="Times New Roman"/>
+                <w:sz w:val="18"/>
+                <w:szCs w:val="18"/>
                 <w:rtl w:val="0"/>
               </w:rPr>
               <w:t xml:space="preserve">Expandir la relación con pymes, empresas, instituciones y corporaciones mediante asesoramiento, rapidez de respuesta y soluciones transaccionales integrales.</w:t>
@@ -9684,14 +10071,106 @@
               <w:spacing w:line="252.00000000000003" w:lineRule="auto"/>
               <w:rPr>
                 <w:rFonts w:ascii="Times New Roman" w:cs="Times New Roman" w:eastAsia="Times New Roman" w:hAnsi="Times New Roman"/>
-              </w:rPr>
-            </w:pPr>
-            <w:r>
-              <w:rPr>
-                <w:rFonts w:ascii="Times New Roman" w:cs="Times New Roman" w:eastAsia="Times New Roman" w:hAnsi="Times New Roman"/>
+                <w:sz w:val="18"/>
+                <w:szCs w:val="18"/>
+              </w:rPr>
+            </w:pPr>
+            <w:r>
+              <w:rPr>
+                <w:rFonts w:ascii="Times New Roman" w:cs="Times New Roman" w:eastAsia="Times New Roman" w:hAnsi="Times New Roman"/>
+                <w:sz w:val="18"/>
+                <w:szCs w:val="18"/>
                 <w:rtl w:val="0"/>
               </w:rPr>
               <w:t xml:space="preserve">Indicadores: cuota, clientes activos, vinculación, ingresos transaccionales, conversión y tiempo de aprobación. Capacidades: onboarding empresarial, cash management, scoring, integración y visión sectorial.</w:t>
+            </w:r>
+          </w:p>
+        </w:tc>
+        <w:tc>
+          <w:tcPr>
+            <w:tcBorders>
+              <w:top w:color="000000" w:space="0" w:sz="0" w:val="nil"/>
+              <w:left w:color="000000" w:space="0" w:sz="0" w:val="nil"/>
+              <w:bottom w:color="d7dee4" w:space="0" w:sz="5" w:val="single"/>
+              <w:right w:color="d7dee4" w:space="0" w:sz="5" w:val="single"/>
+            </w:tcBorders>
+            <w:tcMar>
+              <w:top w:w="80.0" w:type="dxa"/>
+              <w:left w:w="120.0" w:type="dxa"/>
+              <w:bottom w:w="80.0" w:type="dxa"/>
+              <w:right w:w="120.0" w:type="dxa"/>
+            </w:tcMar>
+            <w:vAlign w:val="top"/>
+          </w:tcPr>
+          <w:p>
+            <w:pPr>
+              <w:spacing w:line="252.00000000000003" w:lineRule="auto"/>
+              <w:rPr>
+                <w:rFonts w:ascii="Times New Roman" w:cs="Times New Roman" w:eastAsia="Times New Roman" w:hAnsi="Times New Roman"/>
+                <w:sz w:val="18"/>
+                <w:szCs w:val="18"/>
+              </w:rPr>
+            </w:pPr>
+            <w:commentRangeStart w:id="11"/>
+            <w:r>
+              <w:rPr>
+                <w:rFonts w:ascii="Times New Roman" w:cs="Times New Roman" w:eastAsia="Times New Roman" w:hAnsi="Times New Roman"/>
+                <w:sz w:val="18"/>
+                <w:szCs w:val="18"/>
+                <w:rtl w:val="0"/>
+              </w:rPr>
+              <w:t xml:space="preserve">Cuota de colocaciones vigentes 22.09% y de depósitos 20.90% en 2025; cuota en pymes 21.5%, gran empresa 29.9% y corporativo 19.6% (Banco BBVA Perú, 2026b, p. 12). Clientes activos, vinculación y tiempo de aprobación: NO HAY FUENTES EN INTERNET DISPONIBLES.</w:t>
+            </w:r>
+            <w:commentRangeEnd w:id="11"/>
+            <w:r>
+              <w:rPr>
+                <w:rStyle w:val="CommentReference"/>
+              </w:rPr>
+              <w:commentReference w:id="11"/>
+            </w:r>
+          </w:p>
+        </w:tc>
+        <w:tc>
+          <w:tcPr>
+            <w:tcBorders>
+              <w:top w:color="000000" w:space="0" w:sz="0" w:val="nil"/>
+              <w:left w:color="000000" w:space="0" w:sz="0" w:val="nil"/>
+              <w:bottom w:color="d7dee4" w:space="0" w:sz="5" w:val="single"/>
+              <w:right w:color="d7dee4" w:space="0" w:sz="5" w:val="single"/>
+            </w:tcBorders>
+            <w:tcMar>
+              <w:top w:w="80.0" w:type="dxa"/>
+              <w:left w:w="120.0" w:type="dxa"/>
+              <w:bottom w:w="80.0" w:type="dxa"/>
+              <w:right w:w="120.0" w:type="dxa"/>
+            </w:tcMar>
+            <w:vAlign w:val="top"/>
+          </w:tcPr>
+          <w:p>
+            <w:pPr>
+              <w:spacing w:line="252.00000000000003" w:lineRule="auto"/>
+              <w:rPr>
+                <w:rFonts w:ascii="Times New Roman" w:cs="Times New Roman" w:eastAsia="Times New Roman" w:hAnsi="Times New Roman"/>
+                <w:sz w:val="18"/>
+                <w:szCs w:val="18"/>
+              </w:rPr>
+            </w:pPr>
+            <w:commentRangeStart w:id="12"/>
+            <w:r>
+              <w:rPr>
+                <w:rFonts w:ascii="Times New Roman" w:cs="Times New Roman" w:eastAsia="Times New Roman" w:hAnsi="Times New Roman"/>
+                <w:sz w:val="18"/>
+                <w:szCs w:val="18"/>
+                <w:rtl w:val="0"/>
+              </w:rPr>
+              <w:t xml:space="preserve">Cuota de colocaciones vigentes ≥ 22.5% (+0.4 puntos) y cuota en pymes ≥ 22.5% (+1.0 punto) a 18 meses. Instrumentar tiempo de aprobación en los primeros 6 meses.</w:t>
+            </w:r>
+            <w:commentRangeEnd w:id="12"/>
+            <w:r>
+              <w:rPr>
+                <w:rStyle w:val="CommentReference"/>
+              </w:rPr>
+              <w:commentReference w:id="12"/>
             </w:r>
           </w:p>
         </w:tc>
@@ -9726,6 +10205,8 @@
                 <w:b w:val="1"/>
                 <w:bCs w:val="1"/>
                 <w:color w:val="072146"/>
+                <w:sz w:val="18"/>
+                <w:szCs w:val="18"/>
               </w:rPr>
             </w:pPr>
             <w:r>
@@ -9734,6 +10215,8 @@
                 <w:b w:val="1"/>
                 <w:bCs w:val="1"/>
                 <w:color w:val="072146"/>
+                <w:sz w:val="18"/>
+                <w:szCs w:val="18"/>
                 <w:rtl w:val="0"/>
               </w:rPr>
               <w:t xml:space="preserve">OE4. “Promover una mentalidad de creación de valor y capital</w:t>
@@ -9762,11 +10245,15 @@
               <w:spacing w:line="252.00000000000003" w:lineRule="auto"/>
               <w:rPr>
                 <w:rFonts w:ascii="Times New Roman" w:cs="Times New Roman" w:eastAsia="Times New Roman" w:hAnsi="Times New Roman"/>
-              </w:rPr>
-            </w:pPr>
-            <w:r>
-              <w:rPr>
-                <w:rFonts w:ascii="Times New Roman" w:cs="Times New Roman" w:eastAsia="Times New Roman" w:hAnsi="Times New Roman"/>
+                <w:sz w:val="18"/>
+                <w:szCs w:val="18"/>
+              </w:rPr>
+            </w:pPr>
+            <w:r>
+              <w:rPr>
+                <w:rFonts w:ascii="Times New Roman" w:cs="Times New Roman" w:eastAsia="Times New Roman" w:hAnsi="Times New Roman"/>
+                <w:sz w:val="18"/>
+                <w:szCs w:val="18"/>
                 <w:rtl w:val="0"/>
               </w:rPr>
               <w:t xml:space="preserve">Orientar crecimiento, precios y asignación de recursos a rentabilidad ajustada por riesgo y uso eficiente del capital.</w:t>
@@ -9795,14 +10282,108 @@
               <w:spacing w:line="252.00000000000003" w:lineRule="auto"/>
               <w:rPr>
                 <w:rFonts w:ascii="Times New Roman" w:cs="Times New Roman" w:eastAsia="Times New Roman" w:hAnsi="Times New Roman"/>
-              </w:rPr>
-            </w:pPr>
-            <w:r>
-              <w:rPr>
-                <w:rFonts w:ascii="Times New Roman" w:cs="Times New Roman" w:eastAsia="Times New Roman" w:hAnsi="Times New Roman"/>
+                <w:sz w:val="18"/>
+                <w:szCs w:val="18"/>
+              </w:rPr>
+            </w:pPr>
+            <w:r>
+              <w:rPr>
+                <w:rFonts w:ascii="Times New Roman" w:cs="Times New Roman" w:eastAsia="Times New Roman" w:hAnsi="Times New Roman"/>
+                <w:sz w:val="18"/>
+                <w:szCs w:val="18"/>
                 <w:rtl w:val="0"/>
               </w:rPr>
               <w:t xml:space="preserve">Indicadores: ROE, RORWA, eficiencia, costo de riesgo y rentabilidad por cliente/producto. Capacidades: rentabilidad granular, pricing, modelos de riesgo, automatización y gestión de portafolio.</w:t>
+            </w:r>
+          </w:p>
+        </w:tc>
+        <w:tc>
+          <w:tcPr>
+            <w:tcBorders>
+              <w:top w:color="000000" w:space="0" w:sz="0" w:val="nil"/>
+              <w:left w:color="000000" w:space="0" w:sz="0" w:val="nil"/>
+              <w:bottom w:color="d7dee4" w:space="0" w:sz="5" w:val="single"/>
+              <w:right w:color="d7dee4" w:space="0" w:sz="5" w:val="single"/>
+            </w:tcBorders>
+            <w:shd w:fill="fafbfc" w:val="clear"/>
+            <w:tcMar>
+              <w:top w:w="80.0" w:type="dxa"/>
+              <w:left w:w="120.0" w:type="dxa"/>
+              <w:bottom w:w="80.0" w:type="dxa"/>
+              <w:right w:w="120.0" w:type="dxa"/>
+            </w:tcMar>
+            <w:vAlign w:val="top"/>
+          </w:tcPr>
+          <w:p>
+            <w:pPr>
+              <w:spacing w:line="252.00000000000003" w:lineRule="auto"/>
+              <w:rPr>
+                <w:rFonts w:ascii="Times New Roman" w:cs="Times New Roman" w:eastAsia="Times New Roman" w:hAnsi="Times New Roman"/>
+                <w:sz w:val="18"/>
+                <w:szCs w:val="18"/>
+              </w:rPr>
+            </w:pPr>
+            <w:commentRangeStart w:id="13"/>
+            <w:r>
+              <w:rPr>
+                <w:rFonts w:ascii="Times New Roman" w:cs="Times New Roman" w:eastAsia="Times New Roman" w:hAnsi="Times New Roman"/>
+                <w:sz w:val="18"/>
+                <w:szCs w:val="18"/>
+                <w:rtl w:val="0"/>
+              </w:rPr>
+              <w:t xml:space="preserve">ROE 17.21% (2025) y 18.7% (2T 2026), frente a 20.1% del sistema; ratio de eficiencia 35.9% (2025) y 40.0% (2T 2026); mora 2.69% frente a 2.8% del sistema (2T 2026) (Banco BBVA Perú, 2026a, 2026b). RORWA y costo de riesgo: NO HAY FUENTES EN INTERNET DISPONIBLES.</w:t>
+            </w:r>
+            <w:commentRangeEnd w:id="13"/>
+            <w:r>
+              <w:rPr>
+                <w:rStyle w:val="CommentReference"/>
+              </w:rPr>
+              <w:commentReference w:id="13"/>
+            </w:r>
+          </w:p>
+        </w:tc>
+        <w:tc>
+          <w:tcPr>
+            <w:tcBorders>
+              <w:top w:color="000000" w:space="0" w:sz="0" w:val="nil"/>
+              <w:left w:color="000000" w:space="0" w:sz="0" w:val="nil"/>
+              <w:bottom w:color="d7dee4" w:space="0" w:sz="5" w:val="single"/>
+              <w:right w:color="d7dee4" w:space="0" w:sz="5" w:val="single"/>
+            </w:tcBorders>
+            <w:shd w:fill="fafbfc" w:val="clear"/>
+            <w:tcMar>
+              <w:top w:w="80.0" w:type="dxa"/>
+              <w:left w:w="120.0" w:type="dxa"/>
+              <w:bottom w:w="80.0" w:type="dxa"/>
+              <w:right w:w="120.0" w:type="dxa"/>
+            </w:tcMar>
+            <w:vAlign w:val="top"/>
+          </w:tcPr>
+          <w:p>
+            <w:pPr>
+              <w:spacing w:line="252.00000000000003" w:lineRule="auto"/>
+              <w:rPr>
+                <w:rFonts w:ascii="Times New Roman" w:cs="Times New Roman" w:eastAsia="Times New Roman" w:hAnsi="Times New Roman"/>
+                <w:sz w:val="18"/>
+                <w:szCs w:val="18"/>
+              </w:rPr>
+            </w:pPr>
+            <w:commentRangeStart w:id="14"/>
+            <w:r>
+              <w:rPr>
+                <w:rFonts w:ascii="Times New Roman" w:cs="Times New Roman" w:eastAsia="Times New Roman" w:hAnsi="Times New Roman"/>
+                <w:sz w:val="18"/>
+                <w:szCs w:val="18"/>
+                <w:rtl w:val="0"/>
+              </w:rPr>
+              <w:t xml:space="preserve">ROE ≥ 19.5% (reduce en más de la mitad la brecha de 1.4 puntos con el sistema), ratio de eficiencia ≤ 40.0% y mora ≤ 2.69% a 18 meses. Instrumentar RORWA y costo de riesgo en los primeros 6 meses.</w:t>
+            </w:r>
+            <w:commentRangeEnd w:id="14"/>
+            <w:r>
+              <w:rPr>
+                <w:rStyle w:val="CommentReference"/>
+              </w:rPr>
+              <w:commentReference w:id="14"/>
             </w:r>
           </w:p>
         </w:tc>
@@ -9836,6 +10417,8 @@
                 <w:b w:val="1"/>
                 <w:bCs w:val="1"/>
                 <w:color w:val="072146"/>
+                <w:sz w:val="18"/>
+                <w:szCs w:val="18"/>
               </w:rPr>
             </w:pPr>
             <w:r>
@@ -9844,6 +10427,8 @@
                 <w:b w:val="1"/>
                 <w:bCs w:val="1"/>
                 <w:color w:val="072146"/>
+                <w:sz w:val="18"/>
+                <w:szCs w:val="18"/>
                 <w:rtl w:val="0"/>
               </w:rPr>
               <w:t xml:space="preserve">OE5. “Maximizar IA, innovación, datos y tecnologías Next Gen”</w:t>
@@ -9871,11 +10456,15 @@
               <w:spacing w:line="252.00000000000003" w:lineRule="auto"/>
               <w:rPr>
                 <w:rFonts w:ascii="Times New Roman" w:cs="Times New Roman" w:eastAsia="Times New Roman" w:hAnsi="Times New Roman"/>
-              </w:rPr>
-            </w:pPr>
-            <w:r>
-              <w:rPr>
-                <w:rFonts w:ascii="Times New Roman" w:cs="Times New Roman" w:eastAsia="Times New Roman" w:hAnsi="Times New Roman"/>
+                <w:sz w:val="18"/>
+                <w:szCs w:val="18"/>
+              </w:rPr>
+            </w:pPr>
+            <w:r>
+              <w:rPr>
+                <w:rFonts w:ascii="Times New Roman" w:cs="Times New Roman" w:eastAsia="Times New Roman" w:hAnsi="Times New Roman"/>
+                <w:sz w:val="18"/>
+                <w:szCs w:val="18"/>
                 <w:rtl w:val="0"/>
               </w:rPr>
               <w:t xml:space="preserve">Escalar datos e IA desde pilotos hacia decisiones, interacciones y automatizaciones gobernadas a lo largo de la cadena de valor.</w:t>
@@ -9903,14 +10492,106 @@
               <w:spacing w:line="252.00000000000003" w:lineRule="auto"/>
               <w:rPr>
                 <w:rFonts w:ascii="Times New Roman" w:cs="Times New Roman" w:eastAsia="Times New Roman" w:hAnsi="Times New Roman"/>
-              </w:rPr>
-            </w:pPr>
-            <w:r>
-              <w:rPr>
-                <w:rFonts w:ascii="Times New Roman" w:cs="Times New Roman" w:eastAsia="Times New Roman" w:hAnsi="Times New Roman"/>
+                <w:sz w:val="18"/>
+                <w:szCs w:val="18"/>
+              </w:rPr>
+            </w:pPr>
+            <w:r>
+              <w:rPr>
+                <w:rFonts w:ascii="Times New Roman" w:cs="Times New Roman" w:eastAsia="Times New Roman" w:hAnsi="Times New Roman"/>
+                <w:sz w:val="18"/>
+                <w:szCs w:val="18"/>
                 <w:rtl w:val="0"/>
               </w:rPr>
               <w:t xml:space="preserve">Indicadores: casos en producción, adopción, tiempo de despliegue, calidad de datos, impacto económico y desempeño de modelos. Capacidades: ADA, MLOps, APIs, datos gobernados, seguridad y observabilidad.</w:t>
+            </w:r>
+          </w:p>
+        </w:tc>
+        <w:tc>
+          <w:tcPr>
+            <w:tcBorders>
+              <w:top w:color="000000" w:space="0" w:sz="0" w:val="nil"/>
+              <w:left w:color="000000" w:space="0" w:sz="0" w:val="nil"/>
+              <w:bottom w:color="d7dee4" w:space="0" w:sz="5" w:val="single"/>
+              <w:right w:color="d7dee4" w:space="0" w:sz="5" w:val="single"/>
+            </w:tcBorders>
+            <w:tcMar>
+              <w:top w:w="80.0" w:type="dxa"/>
+              <w:left w:w="120.0" w:type="dxa"/>
+              <w:bottom w:w="80.0" w:type="dxa"/>
+              <w:right w:w="120.0" w:type="dxa"/>
+            </w:tcMar>
+            <w:vAlign w:val="top"/>
+          </w:tcPr>
+          <w:p>
+            <w:pPr>
+              <w:spacing w:line="252.00000000000003" w:lineRule="auto"/>
+              <w:rPr>
+                <w:rFonts w:ascii="Times New Roman" w:cs="Times New Roman" w:eastAsia="Times New Roman" w:hAnsi="Times New Roman"/>
+                <w:sz w:val="18"/>
+                <w:szCs w:val="18"/>
+              </w:rPr>
+            </w:pPr>
+            <w:commentRangeStart w:id="15"/>
+            <w:r>
+              <w:rPr>
+                <w:rFonts w:ascii="Times New Roman" w:cs="Times New Roman" w:eastAsia="Times New Roman" w:hAnsi="Times New Roman"/>
+                <w:sz w:val="18"/>
+                <w:szCs w:val="18"/>
+                <w:rtl w:val="0"/>
+              </w:rPr>
+              <w:t xml:space="preserve">Ventas digitales 79.57% y más de 3 millones de usuarios activos en la app (2T 2026) (Banco BBVA Perú, 2026a); más del 81% de las operaciones realizadas por la app y despliegue de ADA en 2025 (Banco BBVA Perú, 2026b). Casos en producción y tiempo de despliegue: NO HAY FUENTES EN INTERNET DISPONIBLES.</w:t>
+            </w:r>
+            <w:commentRangeEnd w:id="15"/>
+            <w:r>
+              <w:rPr>
+                <w:rStyle w:val="CommentReference"/>
+              </w:rPr>
+              <w:commentReference w:id="15"/>
+            </w:r>
+          </w:p>
+        </w:tc>
+        <w:tc>
+          <w:tcPr>
+            <w:tcBorders>
+              <w:top w:color="000000" w:space="0" w:sz="0" w:val="nil"/>
+              <w:left w:color="000000" w:space="0" w:sz="0" w:val="nil"/>
+              <w:bottom w:color="d7dee4" w:space="0" w:sz="5" w:val="single"/>
+              <w:right w:color="d7dee4" w:space="0" w:sz="5" w:val="single"/>
+            </w:tcBorders>
+            <w:tcMar>
+              <w:top w:w="80.0" w:type="dxa"/>
+              <w:left w:w="120.0" w:type="dxa"/>
+              <w:bottom w:w="80.0" w:type="dxa"/>
+              <w:right w:w="120.0" w:type="dxa"/>
+            </w:tcMar>
+            <w:vAlign w:val="top"/>
+          </w:tcPr>
+          <w:p>
+            <w:pPr>
+              <w:spacing w:line="252.00000000000003" w:lineRule="auto"/>
+              <w:rPr>
+                <w:rFonts w:ascii="Times New Roman" w:cs="Times New Roman" w:eastAsia="Times New Roman" w:hAnsi="Times New Roman"/>
+                <w:sz w:val="18"/>
+                <w:szCs w:val="18"/>
+              </w:rPr>
+            </w:pPr>
+            <w:commentRangeStart w:id="16"/>
+            <w:r>
+              <w:rPr>
+                <w:rFonts w:ascii="Times New Roman" w:cs="Times New Roman" w:eastAsia="Times New Roman" w:hAnsi="Times New Roman"/>
+                <w:sz w:val="18"/>
+                <w:szCs w:val="18"/>
+                <w:rtl w:val="0"/>
+              </w:rPr>
+              <w:t xml:space="preserve">Ventas digitales ≥ 85% (+5.4 puntos) y al menos tres casos de IA priorizados en producción con impacto económico medido a 18 meses. Definir la línea base de casos y de tiempo de despliegue en los primeros 6 meses.</w:t>
+            </w:r>
+            <w:commentRangeEnd w:id="16"/>
+            <w:r>
+              <w:rPr>
+                <w:rStyle w:val="CommentReference"/>
+              </w:rPr>
+              <w:commentReference w:id="16"/>
             </w:r>
           </w:p>
         </w:tc>
@@ -9944,6 +10625,8 @@
                 <w:b w:val="1"/>
                 <w:bCs w:val="1"/>
                 <w:color w:val="072146"/>
+                <w:sz w:val="18"/>
+                <w:szCs w:val="18"/>
               </w:rPr>
             </w:pPr>
             <w:r>
@@ -9952,6 +10635,8 @@
                 <w:b w:val="1"/>
                 <w:bCs w:val="1"/>
                 <w:color w:val="072146"/>
+                <w:sz w:val="18"/>
+                <w:szCs w:val="18"/>
                 <w:rtl w:val="0"/>
               </w:rPr>
               <w:t xml:space="preserve">OE6. “Fortalecer nuestra empatía, triunfar como un equipo ganador”</w:t>
@@ -9979,11 +10664,15 @@
               <w:spacing w:line="252.00000000000003" w:lineRule="auto"/>
               <w:rPr>
                 <w:rFonts w:ascii="Times New Roman" w:cs="Times New Roman" w:eastAsia="Times New Roman" w:hAnsi="Times New Roman"/>
-              </w:rPr>
-            </w:pPr>
-            <w:r>
-              <w:rPr>
-                <w:rFonts w:ascii="Times New Roman" w:cs="Times New Roman" w:eastAsia="Times New Roman" w:hAnsi="Times New Roman"/>
+                <w:sz w:val="18"/>
+                <w:szCs w:val="18"/>
+              </w:rPr>
+            </w:pPr>
+            <w:r>
+              <w:rPr>
+                <w:rFonts w:ascii="Times New Roman" w:cs="Times New Roman" w:eastAsia="Times New Roman" w:hAnsi="Times New Roman"/>
+                <w:sz w:val="18"/>
+                <w:szCs w:val="18"/>
                 <w:rtl w:val="0"/>
               </w:rPr>
               <w:t xml:space="preserve">Mejorar los procesos internos de la empresa, para maximizar el bienestar de los empleados y aumentar las capacidades digitales internas.</w:t>
@@ -10011,14 +10700,106 @@
               <w:spacing w:line="252.00000000000003" w:lineRule="auto"/>
               <w:rPr>
                 <w:rFonts w:ascii="Times New Roman" w:cs="Times New Roman" w:eastAsia="Times New Roman" w:hAnsi="Times New Roman"/>
-              </w:rPr>
-            </w:pPr>
-            <w:r>
-              <w:rPr>
-                <w:rFonts w:ascii="Times New Roman" w:cs="Times New Roman" w:eastAsia="Times New Roman" w:hAnsi="Times New Roman"/>
+                <w:sz w:val="18"/>
+                <w:szCs w:val="18"/>
+              </w:rPr>
+            </w:pPr>
+            <w:r>
+              <w:rPr>
+                <w:rFonts w:ascii="Times New Roman" w:cs="Times New Roman" w:eastAsia="Times New Roman" w:hAnsi="Times New Roman"/>
+                <w:sz w:val="18"/>
+                <w:szCs w:val="18"/>
                 <w:rtl w:val="0"/>
               </w:rPr>
               <w:t xml:space="preserve">Indicadores: Nivel de productividad, tiempo de mejora de implementación de automatizaciones, calidad de datos y desempeño de la estrategia de mejora.</w:t>
+            </w:r>
+          </w:p>
+        </w:tc>
+        <w:tc>
+          <w:tcPr>
+            <w:tcBorders>
+              <w:top w:color="000000" w:space="0" w:sz="0" w:val="nil"/>
+              <w:left w:color="000000" w:space="0" w:sz="0" w:val="nil"/>
+              <w:bottom w:color="d7dee4" w:space="0" w:sz="5" w:val="single"/>
+              <w:right w:color="d7dee4" w:space="0" w:sz="5" w:val="single"/>
+            </w:tcBorders>
+            <w:tcMar>
+              <w:top w:w="80.0" w:type="dxa"/>
+              <w:left w:w="120.0" w:type="dxa"/>
+              <w:bottom w:w="80.0" w:type="dxa"/>
+              <w:right w:w="120.0" w:type="dxa"/>
+            </w:tcMar>
+            <w:vAlign w:val="top"/>
+          </w:tcPr>
+          <w:p>
+            <w:pPr>
+              <w:spacing w:line="252.00000000000003" w:lineRule="auto"/>
+              <w:rPr>
+                <w:rFonts w:ascii="Times New Roman" w:cs="Times New Roman" w:eastAsia="Times New Roman" w:hAnsi="Times New Roman"/>
+                <w:sz w:val="18"/>
+                <w:szCs w:val="18"/>
+              </w:rPr>
+            </w:pPr>
+            <w:commentRangeStart w:id="17"/>
+            <w:r>
+              <w:rPr>
+                <w:rFonts w:ascii="Times New Roman" w:cs="Times New Roman" w:eastAsia="Times New Roman" w:hAnsi="Times New Roman"/>
+                <w:sz w:val="18"/>
+                <w:szCs w:val="18"/>
+                <w:rtl w:val="0"/>
+              </w:rPr>
+              <w:t xml:space="preserve">Índice de compromiso de colaboradores 93/100 en 2025 (Banco BBVA Perú, 2026b, p. 12) y adopción interna de Blue Buddy del 90% en junio de 2026 (Banco BBVA Perú, 2026a). Productividad, tiempo de implementación de automatizaciones y calidad de datos: NO HAY FUENTES EN INTERNET DISPONIBLES.</w:t>
+            </w:r>
+            <w:commentRangeEnd w:id="17"/>
+            <w:r>
+              <w:rPr>
+                <w:rStyle w:val="CommentReference"/>
+              </w:rPr>
+              <w:commentReference w:id="17"/>
+            </w:r>
+          </w:p>
+        </w:tc>
+        <w:tc>
+          <w:tcPr>
+            <w:tcBorders>
+              <w:top w:color="000000" w:space="0" w:sz="0" w:val="nil"/>
+              <w:left w:color="000000" w:space="0" w:sz="0" w:val="nil"/>
+              <w:bottom w:color="d7dee4" w:space="0" w:sz="5" w:val="single"/>
+              <w:right w:color="d7dee4" w:space="0" w:sz="5" w:val="single"/>
+            </w:tcBorders>
+            <w:tcMar>
+              <w:top w:w="80.0" w:type="dxa"/>
+              <w:left w:w="120.0" w:type="dxa"/>
+              <w:bottom w:w="80.0" w:type="dxa"/>
+              <w:right w:w="120.0" w:type="dxa"/>
+            </w:tcMar>
+            <w:vAlign w:val="top"/>
+          </w:tcPr>
+          <w:p>
+            <w:pPr>
+              <w:spacing w:line="252.00000000000003" w:lineRule="auto"/>
+              <w:rPr>
+                <w:rFonts w:ascii="Times New Roman" w:cs="Times New Roman" w:eastAsia="Times New Roman" w:hAnsi="Times New Roman"/>
+                <w:sz w:val="18"/>
+                <w:szCs w:val="18"/>
+              </w:rPr>
+            </w:pPr>
+            <w:commentRangeStart w:id="18"/>
+            <w:r>
+              <w:rPr>
+                <w:rFonts w:ascii="Times New Roman" w:cs="Times New Roman" w:eastAsia="Times New Roman" w:hAnsi="Times New Roman"/>
+                <w:sz w:val="18"/>
+                <w:szCs w:val="18"/>
+                <w:rtl w:val="0"/>
+              </w:rPr>
+              <w:t xml:space="preserve">Índice de compromiso ≥ 93/100 y adopción interna de Blue Buddy ≥ 95% a 18 meses. Definir la línea base de productividad y de automatizaciones en los primeros 6 meses.</w:t>
+            </w:r>
+            <w:commentRangeEnd w:id="18"/>
+            <w:r>
+              <w:rPr>
+                <w:rStyle w:val="CommentReference"/>
+              </w:rPr>
+              <w:commentReference w:id="18"/>
             </w:r>
           </w:p>
         </w:tc>
@@ -10042,17 +10823,20 @@
         </w:rPr>
         <w:t xml:space="preserve">Nota. </w:t>
       </w:r>
-      <w:r>
-        <w:rPr>
-          <w:rFonts w:ascii="Times New Roman" w:cs="Times New Roman" w:eastAsia="Times New Roman" w:hAnsi="Times New Roman"/>
-          <w:rtl w:val="0"/>
-        </w:rPr>
-        <w:t xml:space="preserve">Elaboración propia.</w:t>
-      </w:r>
-      <w:r>
-        <w:rPr>
-          <w:rtl w:val="0"/>
-        </w:rPr>
+      <w:commentRangeStart w:id="19"/>
+      <w:r>
+        <w:rPr>
+          <w:rFonts w:ascii="Times New Roman" w:cs="Times New Roman" w:eastAsia="Times New Roman" w:hAnsi="Times New Roman"/>
+          <w:rtl w:val="0"/>
+        </w:rPr>
+        <w:t>Elaboración propia con base en Banco BBVA Perú (2026a, 2026b) y BBVA (2025). Las líneas base corresponden a datos públicos del periodo indicado; las metas a 18 meses son propuestas del equipo, pendientes de validación con la entidad. La frase “NO HAY FUENTES EN INTERNET DISPONIBLES” señala indicadores sin dato público, que deberán instrumentarse como parte de la meta.</w:t>
+      </w:r>
+      <w:commentRangeEnd w:id="19"/>
+      <w:r>
+        <w:rPr>
+          <w:rStyle w:val="CommentReference"/>
+        </w:rPr>
+        <w:commentReference w:id="19"/>
       </w:r>
     </w:p>
     <w:p>
@@ -12956,6 +13740,21 @@
         </w:rPr>
         <w:t xml:space="preserve">Un proceso se considera crítico cuando su falla impide alcanzar un objetivo estratégico declarado, genera pérdida económica material o expone al Banco a incumplimiento regulatorio. La evaluación pondera cinco criterios: contribución a las prioridades del ciclo 2025-2029, impacto económico, exposición regulatoria, volumen de ejecución y dependencia de los demás procesos. El criterio regulatorio recoge la orientación reciente del supervisor, que trasladó la exigencia de resiliencia operacional hacia los servicios prestados por canales digitales (SBS, 2025).</w:t>
       </w:r>
+      <w:commentRangeStart w:id="20"/>
+      <w:r>
+        <w:rPr>
+          <w:rFonts w:ascii="Times New Roman" w:cs="Times New Roman" w:eastAsia="Times New Roman" w:hAnsi="Times New Roman"/>
+          <w:rtl w:val="0"/>
+        </w:rPr>
+        <w:t xml:space="preserve"> Además, la criticidad se verifica contra la totalidad de los objetivos de la Tabla 10: cada macroproceso crítico se asocia de forma explícita con los objetivos que habilita, de modo que OE1 a OE6 queden cubiertos.</w:t>
+      </w:r>
+      <w:commentRangeEnd w:id="20"/>
+      <w:r>
+        <w:rPr>
+          <w:rStyle w:val="CommentReference"/>
+        </w:rPr>
+        <w:commentReference w:id="20"/>
+      </w:r>
     </w:p>
     <w:p>
       <w:pPr>
@@ -13002,7 +13801,7 @@
     <w:tbl>
       <w:tblPr>
         <w:tblStyle w:val="Table12"/>
-        <w:tblW w:w="8385.0" w:type="dxa"/>
+        <w:tblW w:w="8385" w:type="dxa"/>
         <w:jc w:val="left"/>
         <w:tblInd w:w="690.0" w:type="dxa"/>
         <w:tblBorders>
@@ -13017,8 +13816,9 @@
         <w:tblLook w:val="0600"/>
       </w:tblPr>
       <w:tblGrid>
-        <w:gridCol w:w="3285"/>
-        <w:gridCol w:w="5100"/>
+        <w:gridCol w:w="2000"/>
+        <w:gridCol w:w="3600"/>
+        <w:gridCol w:w="2785"/>
         <w:tblGridChange w:id="0">
           <w:tblGrid>
             <w:gridCol w:w="3285"/>
@@ -13068,12 +13868,16 @@
               <w:rPr>
                 <w:rFonts w:ascii="Times New Roman" w:cs="Times New Roman" w:eastAsia="Times New Roman" w:hAnsi="Times New Roman"/>
                 <w:color w:val="fafbfc"/>
+                <w:sz w:val="18"/>
+                <w:szCs w:val="18"/>
               </w:rPr>
             </w:pPr>
             <w:r>
               <w:rPr>
                 <w:rFonts w:ascii="Times New Roman" w:cs="Times New Roman" w:eastAsia="Times New Roman" w:hAnsi="Times New Roman"/>
                 <w:color w:val="fafbfc"/>
+                <w:sz w:val="18"/>
+                <w:szCs w:val="18"/>
                 <w:rtl w:val="0"/>
               </w:rPr>
               <w:t xml:space="preserve">Macroproceso </w:t>
@@ -13117,24 +13921,22 @@
               <w:rPr>
                 <w:rFonts w:ascii="Times New Roman" w:cs="Times New Roman" w:eastAsia="Times New Roman" w:hAnsi="Times New Roman"/>
                 <w:color w:val="fafbfc"/>
+                <w:sz w:val="18"/>
+                <w:szCs w:val="18"/>
               </w:rPr>
             </w:pPr>
             <w:r>
               <w:rPr>
                 <w:rFonts w:ascii="Times New Roman" w:cs="Times New Roman" w:eastAsia="Times New Roman" w:hAnsi="Times New Roman"/>
                 <w:color w:val="fafbfc"/>
+                <w:sz w:val="18"/>
+                <w:szCs w:val="18"/>
                 <w:rtl w:val="0"/>
               </w:rPr>
               <w:t xml:space="preserve">Fundamento de la criticidad </w:t>
             </w:r>
           </w:p>
         </w:tc>
-      </w:tr>
-      <w:tr>
-        <w:trPr>
-          <w:cantSplit w:val="0"/>
-          <w:tblHeader w:val="0"/>
-        </w:trPr>
         <w:tc>
           <w:tcPr>
             <w:tcBorders>
@@ -13143,7 +13945,7 @@
               <w:bottom w:color="d7dee4" w:space="0" w:sz="8" w:val="single"/>
               <w:right w:color="d7dee4" w:space="0" w:sz="8" w:val="single"/>
             </w:tcBorders>
-            <w:shd w:fill="auto" w:val="clear"/>
+            <w:shd w:fill="004481" w:val="clear"/>
             <w:tcMar>
               <w:top w:w="100.0" w:type="dxa"/>
               <w:left w:w="100.0" w:type="dxa"/>
@@ -13171,23 +13973,37 @@
               <w:jc w:val="left"/>
               <w:rPr>
                 <w:rFonts w:ascii="Times New Roman" w:cs="Times New Roman" w:eastAsia="Times New Roman" w:hAnsi="Times New Roman"/>
-                <w:b w:val="1"/>
-                <w:bCs w:val="1"/>
-                <w:color w:val="072146"/>
-              </w:rPr>
-            </w:pPr>
-            <w:r>
-              <w:rPr>
-                <w:rFonts w:ascii="Times New Roman" w:cs="Times New Roman" w:eastAsia="Times New Roman" w:hAnsi="Times New Roman"/>
-                <w:b w:val="1"/>
-                <w:bCs w:val="1"/>
-                <w:color w:val="072146"/>
-                <w:rtl w:val="0"/>
-              </w:rPr>
-              <w:t xml:space="preserve">Operación de canales y servicios digitales </w:t>
-            </w:r>
-          </w:p>
-        </w:tc>
+                <w:color w:val="fafbfc"/>
+                <w:sz w:val="18"/>
+                <w:szCs w:val="18"/>
+              </w:rPr>
+            </w:pPr>
+            <w:commentRangeStart w:id="21"/>
+            <w:r>
+              <w:rPr>
+                <w:rFonts w:ascii="Times New Roman" w:cs="Times New Roman" w:eastAsia="Times New Roman" w:hAnsi="Times New Roman"/>
+                <w:color w:val="fafbfc"/>
+                <w:sz w:val="18"/>
+                <w:szCs w:val="18"/>
+                <w:rtl w:val="0"/>
+              </w:rPr>
+              <w:t xml:space="preserve">Objetivos estratégicos que habilita</w:t>
+            </w:r>
+            <w:commentRangeEnd w:id="21"/>
+            <w:r>
+              <w:rPr>
+                <w:rStyle w:val="CommentReference"/>
+              </w:rPr>
+              <w:commentReference w:id="21"/>
+            </w:r>
+          </w:p>
+        </w:tc>
+      </w:tr>
+      <w:tr>
+        <w:trPr>
+          <w:cantSplit w:val="0"/>
+          <w:tblHeader w:val="0"/>
+        </w:trPr>
         <w:tc>
           <w:tcPr>
             <w:tcBorders>
@@ -13224,23 +14040,27 @@
               <w:jc w:val="left"/>
               <w:rPr>
                 <w:rFonts w:ascii="Times New Roman" w:cs="Times New Roman" w:eastAsia="Times New Roman" w:hAnsi="Times New Roman"/>
-              </w:rPr>
-            </w:pPr>
-            <w:r>
-              <w:rPr>
-                <w:rFonts w:ascii="Times New Roman" w:cs="Times New Roman" w:eastAsia="Times New Roman" w:hAnsi="Times New Roman"/>
-                <w:rtl w:val="0"/>
-              </w:rPr>
-              <w:t xml:space="preserve">Procesa 581.7 millones de transacciones digitales anuales y más del 81% de las operaciones del Banco. La norma de continuidad exige priorizar los servicios prestados por canales digitales </w:t>
-            </w:r>
-          </w:p>
-        </w:tc>
-      </w:tr>
-      <w:tr>
-        <w:trPr>
-          <w:cantSplit w:val="0"/>
-          <w:tblHeader w:val="0"/>
-        </w:trPr>
+                <w:b w:val="1"/>
+                <w:bCs w:val="1"/>
+                <w:color w:val="072146"/>
+                <w:sz w:val="18"/>
+                <w:szCs w:val="18"/>
+              </w:rPr>
+            </w:pPr>
+            <w:r>
+              <w:rPr>
+                <w:rFonts w:ascii="Times New Roman" w:cs="Times New Roman" w:eastAsia="Times New Roman" w:hAnsi="Times New Roman"/>
+                <w:b w:val="1"/>
+                <w:bCs w:val="1"/>
+                <w:color w:val="072146"/>
+                <w:sz w:val="18"/>
+                <w:szCs w:val="18"/>
+                <w:rtl w:val="0"/>
+              </w:rPr>
+              <w:t xml:space="preserve">Operación de canales y servicios digitales </w:t>
+            </w:r>
+          </w:p>
+        </w:tc>
         <w:tc>
           <w:tcPr>
             <w:tcBorders>
@@ -13249,7 +14069,7 @@
               <w:bottom w:color="d7dee4" w:space="0" w:sz="8" w:val="single"/>
               <w:right w:color="d7dee4" w:space="0" w:sz="8" w:val="single"/>
             </w:tcBorders>
-            <w:shd w:fill="fafbfc" w:val="clear"/>
+            <w:shd w:fill="auto" w:val="clear"/>
             <w:tcMar>
               <w:top w:w="100.0" w:type="dxa"/>
               <w:left w:w="100.0" w:type="dxa"/>
@@ -13277,20 +14097,18 @@
               <w:jc w:val="left"/>
               <w:rPr>
                 <w:rFonts w:ascii="Times New Roman" w:cs="Times New Roman" w:eastAsia="Times New Roman" w:hAnsi="Times New Roman"/>
-                <w:b w:val="1"/>
-                <w:bCs w:val="1"/>
-                <w:color w:val="072146"/>
-              </w:rPr>
-            </w:pPr>
-            <w:r>
-              <w:rPr>
-                <w:rFonts w:ascii="Times New Roman" w:cs="Times New Roman" w:eastAsia="Times New Roman" w:hAnsi="Times New Roman"/>
-                <w:b w:val="1"/>
-                <w:bCs w:val="1"/>
-                <w:color w:val="072146"/>
-                <w:rtl w:val="0"/>
-              </w:rPr>
-              <w:t xml:space="preserve">Gestión de datos, analítica e inteligencia artificial </w:t>
+                <w:sz w:val="18"/>
+                <w:szCs w:val="18"/>
+              </w:rPr>
+            </w:pPr>
+            <w:r>
+              <w:rPr>
+                <w:rFonts w:ascii="Times New Roman" w:cs="Times New Roman" w:eastAsia="Times New Roman" w:hAnsi="Times New Roman"/>
+                <w:sz w:val="18"/>
+                <w:szCs w:val="18"/>
+                <w:rtl w:val="0"/>
+              </w:rPr>
+              <w:t xml:space="preserve">Procesa 581.7 millones de transacciones digitales anuales y más del 81% de las operaciones del Banco. La norma de continuidad exige priorizar los servicios prestados por canales digitales </w:t>
             </w:r>
           </w:p>
         </w:tc>
@@ -13302,7 +14120,7 @@
               <w:bottom w:color="d7dee4" w:space="0" w:sz="8" w:val="single"/>
               <w:right w:color="d7dee4" w:space="0" w:sz="8" w:val="single"/>
             </w:tcBorders>
-            <w:shd w:fill="fafbfc" w:val="clear"/>
+            <w:shd w:fill="auto" w:val="clear"/>
             <w:tcMar>
               <w:top w:w="100.0" w:type="dxa"/>
               <w:left w:w="100.0" w:type="dxa"/>
@@ -13330,14 +14148,26 @@
               <w:jc w:val="left"/>
               <w:rPr>
                 <w:rFonts w:ascii="Times New Roman" w:cs="Times New Roman" w:eastAsia="Times New Roman" w:hAnsi="Times New Roman"/>
-              </w:rPr>
-            </w:pPr>
-            <w:r>
-              <w:rPr>
-                <w:rFonts w:ascii="Times New Roman" w:cs="Times New Roman" w:eastAsia="Times New Roman" w:hAnsi="Times New Roman"/>
-                <w:rtl w:val="0"/>
-              </w:rPr>
-              <w:t xml:space="preserve">Materializa el objetivo OE5, que declara la disponibilidad de datos y las tecnologías de nueva generación como prioridad estratégica. Sustenta la plataforma corporativa de datos desplegada en 2025 </w:t>
+                <w:sz w:val="18"/>
+                <w:szCs w:val="18"/>
+              </w:rPr>
+            </w:pPr>
+            <w:commentRangeStart w:id="22"/>
+            <w:r>
+              <w:rPr>
+                <w:rFonts w:ascii="Times New Roman" w:cs="Times New Roman" w:eastAsia="Times New Roman" w:hAnsi="Times New Roman"/>
+                <w:sz w:val="18"/>
+                <w:szCs w:val="18"/>
+                <w:rtl w:val="0"/>
+              </w:rPr>
+              <w:t xml:space="preserve">OE1: sostiene la experiencia omnicanal y el NPS (retail 52.57%; pyme 33.6%). OE3: soporta el onboarding y las soluciones transaccionales de empresas (cash management). OE4: concentra el volumen operativo que determina el ratio de eficiencia (40.0% al 2T 2026).</w:t>
+            </w:r>
+            <w:commentRangeEnd w:id="22"/>
+            <w:r>
+              <w:rPr>
+                <w:rStyle w:val="CommentReference"/>
+              </w:rPr>
+              <w:commentReference w:id="22"/>
             </w:r>
           </w:p>
         </w:tc>
@@ -13355,7 +14185,7 @@
               <w:bottom w:color="d7dee4" w:space="0" w:sz="8" w:val="single"/>
               <w:right w:color="d7dee4" w:space="0" w:sz="8" w:val="single"/>
             </w:tcBorders>
-            <w:shd w:fill="auto" w:val="clear"/>
+            <w:shd w:fill="fafbfc" w:val="clear"/>
             <w:tcMar>
               <w:top w:w="100.0" w:type="dxa"/>
               <w:left w:w="100.0" w:type="dxa"/>
@@ -13386,6 +14216,8 @@
                 <w:b w:val="1"/>
                 <w:bCs w:val="1"/>
                 <w:color w:val="072146"/>
+                <w:sz w:val="18"/>
+                <w:szCs w:val="18"/>
               </w:rPr>
             </w:pPr>
             <w:r>
@@ -13394,9 +14226,11 @@
                 <w:b w:val="1"/>
                 <w:bCs w:val="1"/>
                 <w:color w:val="072146"/>
-                <w:rtl w:val="0"/>
-              </w:rPr>
-              <w:t xml:space="preserve">Seguridad de la información y ciberseguridad </w:t>
+                <w:sz w:val="18"/>
+                <w:szCs w:val="18"/>
+                <w:rtl w:val="0"/>
+              </w:rPr>
+              <w:t xml:space="preserve">Gestión de datos, analítica e inteligencia artificial </w:t>
             </w:r>
           </w:p>
         </w:tc>
@@ -13408,7 +14242,7 @@
               <w:bottom w:color="d7dee4" w:space="0" w:sz="8" w:val="single"/>
               <w:right w:color="d7dee4" w:space="0" w:sz="8" w:val="single"/>
             </w:tcBorders>
-            <w:shd w:fill="auto" w:val="clear"/>
+            <w:shd w:fill="fafbfc" w:val="clear"/>
             <w:tcMar>
               <w:top w:w="100.0" w:type="dxa"/>
               <w:left w:w="100.0" w:type="dxa"/>
@@ -13436,14 +14270,250 @@
               <w:jc w:val="left"/>
               <w:rPr>
                 <w:rFonts w:ascii="Times New Roman" w:cs="Times New Roman" w:eastAsia="Times New Roman" w:hAnsi="Times New Roman"/>
-              </w:rPr>
-            </w:pPr>
-            <w:r>
-              <w:rPr>
-                <w:rFonts w:ascii="Times New Roman" w:cs="Times New Roman" w:eastAsia="Times New Roman" w:hAnsi="Times New Roman"/>
+                <w:sz w:val="18"/>
+                <w:szCs w:val="18"/>
+              </w:rPr>
+            </w:pPr>
+            <w:r>
+              <w:rPr>
+                <w:rFonts w:ascii="Times New Roman" w:cs="Times New Roman" w:eastAsia="Times New Roman" w:hAnsi="Times New Roman"/>
+                <w:sz w:val="18"/>
+                <w:szCs w:val="18"/>
+                <w:rtl w:val="0"/>
+              </w:rPr>
+              <w:t xml:space="preserve">Materializa el objetivo OE5, que declara la disponibilidad de datos y las tecnologías de nueva generación como prioridad estratégica. Sustenta la plataforma corporativa de datos desplegada en 2025 </w:t>
+            </w:r>
+          </w:p>
+        </w:tc>
+        <w:tc>
+          <w:tcPr>
+            <w:tcBorders>
+              <w:top w:color="d7dee4" w:space="0" w:sz="8" w:val="single"/>
+              <w:left w:color="d7dee4" w:space="0" w:sz="8" w:val="single"/>
+              <w:bottom w:color="d7dee4" w:space="0" w:sz="8" w:val="single"/>
+              <w:right w:color="d7dee4" w:space="0" w:sz="8" w:val="single"/>
+            </w:tcBorders>
+            <w:shd w:fill="fafbfc" w:val="clear"/>
+            <w:tcMar>
+              <w:top w:w="100.0" w:type="dxa"/>
+              <w:left w:w="100.0" w:type="dxa"/>
+              <w:bottom w:w="100.0" w:type="dxa"/>
+              <w:right w:w="100.0" w:type="dxa"/>
+            </w:tcMar>
+            <w:vAlign w:val="top"/>
+          </w:tcPr>
+          <w:p>
+            <w:pPr>
+              <w:keepNext w:val="0"/>
+              <w:keepLines w:val="0"/>
+              <w:pageBreakBefore w:val="0"/>
+              <w:widowControl w:val="0"/>
+              <w:pBdr>
+                <w:top w:space="0" w:sz="0" w:val="nil"/>
+                <w:left w:space="0" w:sz="0" w:val="nil"/>
+                <w:bottom w:space="0" w:sz="0" w:val="nil"/>
+                <w:right w:space="0" w:sz="0" w:val="nil"/>
+                <w:between w:space="0" w:sz="0" w:val="nil"/>
+              </w:pBdr>
+              <w:shd w:fill="auto" w:val="clear"/>
+              <w:spacing w:after="0" w:before="0" w:line="240" w:lineRule="auto"/>
+              <w:ind w:left="0" w:right="0" w:firstLine="0"/>
+              <w:jc w:val="left"/>
+              <w:rPr>
+                <w:rFonts w:ascii="Times New Roman" w:cs="Times New Roman" w:eastAsia="Times New Roman" w:hAnsi="Times New Roman"/>
+                <w:sz w:val="18"/>
+                <w:szCs w:val="18"/>
+              </w:rPr>
+            </w:pPr>
+            <w:commentRangeStart w:id="23"/>
+            <w:r>
+              <w:rPr>
+                <w:rFonts w:ascii="Times New Roman" w:cs="Times New Roman" w:eastAsia="Times New Roman" w:hAnsi="Times New Roman"/>
+                <w:sz w:val="18"/>
+                <w:szCs w:val="18"/>
+                <w:rtl w:val="0"/>
+              </w:rPr>
+              <w:t xml:space="preserve">OE5: objetivo directo. OE2: aloja la taxonomía, la trazabilidad y los datos ESG con que se mide y reporta la facturación sostenible (S/ 8,989 millones al 1S 2026). OE4: aporta rentabilidad por cliente, pricing y modelos de riesgo que sustentan el ROE (18.7%) y la mora (2.69%). OE6: calidad de datos y automatizaciones internas.</w:t>
+            </w:r>
+            <w:commentRangeEnd w:id="23"/>
+            <w:r>
+              <w:rPr>
+                <w:rStyle w:val="CommentReference"/>
+              </w:rPr>
+              <w:commentReference w:id="23"/>
+            </w:r>
+          </w:p>
+        </w:tc>
+      </w:tr>
+      <w:tr>
+        <w:trPr>
+          <w:cantSplit w:val="0"/>
+          <w:tblHeader w:val="0"/>
+        </w:trPr>
+        <w:tc>
+          <w:tcPr>
+            <w:tcBorders>
+              <w:top w:color="d7dee4" w:space="0" w:sz="8" w:val="single"/>
+              <w:left w:color="d7dee4" w:space="0" w:sz="8" w:val="single"/>
+              <w:bottom w:color="d7dee4" w:space="0" w:sz="8" w:val="single"/>
+              <w:right w:color="d7dee4" w:space="0" w:sz="8" w:val="single"/>
+            </w:tcBorders>
+            <w:shd w:fill="auto" w:val="clear"/>
+            <w:tcMar>
+              <w:top w:w="100.0" w:type="dxa"/>
+              <w:left w:w="100.0" w:type="dxa"/>
+              <w:bottom w:w="100.0" w:type="dxa"/>
+              <w:right w:w="100.0" w:type="dxa"/>
+            </w:tcMar>
+            <w:vAlign w:val="top"/>
+          </w:tcPr>
+          <w:p>
+            <w:pPr>
+              <w:keepNext w:val="0"/>
+              <w:keepLines w:val="0"/>
+              <w:pageBreakBefore w:val="0"/>
+              <w:widowControl w:val="0"/>
+              <w:pBdr>
+                <w:top w:space="0" w:sz="0" w:val="nil"/>
+                <w:left w:space="0" w:sz="0" w:val="nil"/>
+                <w:bottom w:space="0" w:sz="0" w:val="nil"/>
+                <w:right w:space="0" w:sz="0" w:val="nil"/>
+                <w:between w:space="0" w:sz="0" w:val="nil"/>
+              </w:pBdr>
+              <w:shd w:fill="auto" w:val="clear"/>
+              <w:spacing w:after="0" w:before="0" w:line="240" w:lineRule="auto"/>
+              <w:ind w:left="0" w:right="0" w:firstLine="0"/>
+              <w:jc w:val="left"/>
+              <w:rPr>
+                <w:rFonts w:ascii="Times New Roman" w:cs="Times New Roman" w:eastAsia="Times New Roman" w:hAnsi="Times New Roman"/>
+                <w:b w:val="1"/>
+                <w:bCs w:val="1"/>
+                <w:color w:val="072146"/>
+                <w:sz w:val="18"/>
+                <w:szCs w:val="18"/>
+              </w:rPr>
+            </w:pPr>
+            <w:r>
+              <w:rPr>
+                <w:rFonts w:ascii="Times New Roman" w:cs="Times New Roman" w:eastAsia="Times New Roman" w:hAnsi="Times New Roman"/>
+                <w:b w:val="1"/>
+                <w:bCs w:val="1"/>
+                <w:color w:val="072146"/>
+                <w:sz w:val="18"/>
+                <w:szCs w:val="18"/>
+                <w:rtl w:val="0"/>
+              </w:rPr>
+              <w:t xml:space="preserve">Seguridad de la información y ciberseguridad </w:t>
+            </w:r>
+          </w:p>
+        </w:tc>
+        <w:tc>
+          <w:tcPr>
+            <w:tcBorders>
+              <w:top w:color="d7dee4" w:space="0" w:sz="8" w:val="single"/>
+              <w:left w:color="d7dee4" w:space="0" w:sz="8" w:val="single"/>
+              <w:bottom w:color="d7dee4" w:space="0" w:sz="8" w:val="single"/>
+              <w:right w:color="d7dee4" w:space="0" w:sz="8" w:val="single"/>
+            </w:tcBorders>
+            <w:shd w:fill="auto" w:val="clear"/>
+            <w:tcMar>
+              <w:top w:w="100.0" w:type="dxa"/>
+              <w:left w:w="100.0" w:type="dxa"/>
+              <w:bottom w:w="100.0" w:type="dxa"/>
+              <w:right w:w="100.0" w:type="dxa"/>
+            </w:tcMar>
+            <w:vAlign w:val="top"/>
+          </w:tcPr>
+          <w:p>
+            <w:pPr>
+              <w:keepNext w:val="0"/>
+              <w:keepLines w:val="0"/>
+              <w:pageBreakBefore w:val="0"/>
+              <w:widowControl w:val="0"/>
+              <w:pBdr>
+                <w:top w:space="0" w:sz="0" w:val="nil"/>
+                <w:left w:space="0" w:sz="0" w:val="nil"/>
+                <w:bottom w:space="0" w:sz="0" w:val="nil"/>
+                <w:right w:space="0" w:sz="0" w:val="nil"/>
+                <w:between w:space="0" w:sz="0" w:val="nil"/>
+              </w:pBdr>
+              <w:shd w:fill="auto" w:val="clear"/>
+              <w:spacing w:after="0" w:before="0" w:line="240" w:lineRule="auto"/>
+              <w:ind w:left="0" w:right="0" w:firstLine="0"/>
+              <w:jc w:val="left"/>
+              <w:rPr>
+                <w:rFonts w:ascii="Times New Roman" w:cs="Times New Roman" w:eastAsia="Times New Roman" w:hAnsi="Times New Roman"/>
+                <w:sz w:val="18"/>
+                <w:szCs w:val="18"/>
+              </w:rPr>
+            </w:pPr>
+            <w:r>
+              <w:rPr>
+                <w:rFonts w:ascii="Times New Roman" w:cs="Times New Roman" w:eastAsia="Times New Roman" w:hAnsi="Times New Roman"/>
+                <w:sz w:val="18"/>
+                <w:szCs w:val="18"/>
                 <w:rtl w:val="0"/>
               </w:rPr>
               <w:t xml:space="preserve">Único macroproceso sujeto a régimen normativo con sanciones propias, construido sobre estándares NIST e ISO/IEC. Protege la operación digital y los datos de 9,465,848 clientes </w:t>
+            </w:r>
+          </w:p>
+        </w:tc>
+        <w:tc>
+          <w:tcPr>
+            <w:tcBorders>
+              <w:top w:color="d7dee4" w:space="0" w:sz="8" w:val="single"/>
+              <w:left w:color="d7dee4" w:space="0" w:sz="8" w:val="single"/>
+              <w:bottom w:color="d7dee4" w:space="0" w:sz="8" w:val="single"/>
+              <w:right w:color="d7dee4" w:space="0" w:sz="8" w:val="single"/>
+            </w:tcBorders>
+            <w:shd w:fill="auto" w:val="clear"/>
+            <w:tcMar>
+              <w:top w:w="100.0" w:type="dxa"/>
+              <w:left w:w="100.0" w:type="dxa"/>
+              <w:bottom w:w="100.0" w:type="dxa"/>
+              <w:right w:w="100.0" w:type="dxa"/>
+            </w:tcMar>
+            <w:vAlign w:val="top"/>
+          </w:tcPr>
+          <w:p>
+            <w:pPr>
+              <w:keepNext w:val="0"/>
+              <w:keepLines w:val="0"/>
+              <w:pageBreakBefore w:val="0"/>
+              <w:widowControl w:val="0"/>
+              <w:pBdr>
+                <w:top w:space="0" w:sz="0" w:val="nil"/>
+                <w:left w:space="0" w:sz="0" w:val="nil"/>
+                <w:bottom w:space="0" w:sz="0" w:val="nil"/>
+                <w:right w:space="0" w:sz="0" w:val="nil"/>
+                <w:between w:space="0" w:sz="0" w:val="nil"/>
+              </w:pBdr>
+              <w:shd w:fill="auto" w:val="clear"/>
+              <w:spacing w:after="0" w:before="0" w:line="240" w:lineRule="auto"/>
+              <w:ind w:left="0" w:right="0" w:firstLine="0"/>
+              <w:jc w:val="left"/>
+              <w:rPr>
+                <w:rFonts w:ascii="Times New Roman" w:cs="Times New Roman" w:eastAsia="Times New Roman" w:hAnsi="Times New Roman"/>
+                <w:sz w:val="18"/>
+                <w:szCs w:val="18"/>
+              </w:rPr>
+            </w:pPr>
+            <w:commentRangeStart w:id="24"/>
+            <w:r>
+              <w:rPr>
+                <w:rFonts w:ascii="Times New Roman" w:cs="Times New Roman" w:eastAsia="Times New Roman" w:hAnsi="Times New Roman"/>
+                <w:sz w:val="18"/>
+                <w:szCs w:val="18"/>
+                <w:rtl w:val="0"/>
+              </w:rPr>
+              <w:t xml:space="preserve">Habilitador transversal: protege los datos y la continuidad que requieren todos los objetivos. OE1: confianza del cliente. OE2: integridad del dato ESG reportado. OE5: datos gobernados, seguridad y observabilidad (Tabla 10).</w:t>
+            </w:r>
+            <w:commentRangeEnd w:id="24"/>
+            <w:r>
+              <w:rPr>
+                <w:rStyle w:val="CommentReference"/>
+              </w:rPr>
+              <w:commentReference w:id="24"/>
             </w:r>
           </w:p>
         </w:tc>
@@ -13468,17 +14538,20 @@
         </w:rPr>
         <w:t xml:space="preserve">Nota.</w:t>
       </w:r>
-      <w:r>
-        <w:rPr>
-          <w:rFonts w:ascii="Times New Roman" w:cs="Times New Roman" w:eastAsia="Times New Roman" w:hAnsi="Times New Roman"/>
-          <w:rtl w:val="0"/>
-        </w:rPr>
-        <w:t xml:space="preserve"> Elaboración propia.</w:t>
-      </w:r>
-      <w:r>
-        <w:rPr>
-          <w:rtl w:val="0"/>
-        </w:rPr>
+      <w:commentRangeStart w:id="25"/>
+      <w:r>
+        <w:rPr>
+          <w:rFonts w:ascii="Times New Roman" w:cs="Times New Roman" w:eastAsia="Times New Roman" w:hAnsi="Times New Roman"/>
+          <w:rtl w:val="0"/>
+        </w:rPr>
+        <w:t xml:space="preserve"> Elaboración propia con base en la Tabla 10. Cobertura: OE1, OE3 y OE4 por la operación de canales; OE2, OE4, OE5 y OE6 por la gestión de datos, analítica e IA; y seguridad como habilitador transversal. Cada objetivo cuenta con al menos un macroproceso crítico.</w:t>
+      </w:r>
+      <w:commentRangeEnd w:id="25"/>
+      <w:r>
+        <w:rPr>
+          <w:rStyle w:val="CommentReference"/>
+        </w:rPr>
+        <w:commentReference w:id="25"/>
       </w:r>
     </w:p>
     <w:p>
@@ -15107,6 +16180,406 @@
           <w:rtl w:val="0"/>
         </w:rPr>
         <w:t xml:space="preserve">tenemos que aplicar las correcciones en base al feedback del JP para el entregable parcial</w:t>
+      </w:r>
+    </w:p>
+  </w:comment>
+  <w:comment w:id="1" w:author="Jorge Chamorro" w:initials="JC" w:date="2026-10-03T16:24:52Z">
+    <w:p>
+      <w:pPr>
+        <w:pStyle w:val="CommentText"/>
+      </w:pPr>
+      <w:r>
+        <w:rPr>
+          <w:rStyle w:val="CommentReference"/>
+        </w:rPr>
+        <w:annotationRef/>
+      </w:r>
+      <w:r>
+        <w:t>Corrección Práctica 1, criterio 1 (Descripción de la Empresa): el docente pidió profundizar la brecha NPS Retail 52.57% vs. Pyme 33.6%. Se cuantifica la brecha (52.57 − 33.6 = 18.97 puntos; 33.6 / 52.57 ≈ 0.64) y se agrega un tercer referente verificable, el NPS de Banca de Empresas e Instituciones (43.6%). Datos tomados de la Memoria anual 2025, pp. 26 y 29 (Banco BBVA Perú, 2026b).</w:t>
+      </w:r>
+    </w:p>
+  </w:comment>
+  <w:comment w:id="2" w:author="Jorge Chamorro" w:initials="JC" w:date="2026-10-03T16:24:52Z">
+    <w:p>
+      <w:pPr>
+        <w:pStyle w:val="CommentText"/>
+      </w:pPr>
+      <w:r>
+        <w:rPr>
+          <w:rStyle w:val="CommentReference"/>
+        </w:rPr>
+        <w:annotationRef/>
+      </w:r>
+      <w:r>
+        <w:t>Corrección Práctica 1, criterio 1: nuevo párrafo que operacionaliza la brecha de satisfacción (brecha absoluta, razón Pyme/Retail y distancia frente a BEI), como pidió el docente para sustentar las iniciativas de TI y los dolores de negocio de las siguientes prácticas. Se declara explícitamente que no se identificó un referente competitivo público del NPS Pyme (no se inventa dato). La meta de NPS Pyme ≥ 43.0% es una propuesta del equipo, pendiente de validación con la entidad.</w:t>
+      </w:r>
+    </w:p>
+  </w:comment>
+  <w:comment w:id="3" w:author="Jorge Chamorro" w:initials="JC" w:date="2026-10-03T16:24:52Z">
+    <w:p>
+      <w:pPr>
+        <w:pStyle w:val="CommentText"/>
+      </w:pPr>
+      <w:r>
+        <w:rPr>
+          <w:rStyle w:val="CommentReference"/>
+        </w:rPr>
+        <w:annotationRef/>
+      </w:r>
+      <w:r>
+        <w:t>Corrección Práctica 1, criterio 2 (Objetivos estratégicos, 2/3): el docente indicó que los objetivos deben ser plenamente cuantificables y que faltaban la línea base numérica del banco en el país y la meta cuantitativa concreta. Esta oración presenta las dos columnas nuevas de la Tabla 10.</w:t>
+      </w:r>
+    </w:p>
+  </w:comment>
+  <w:comment w:id="4" w:author="Jorge Chamorro" w:initials="JC" w:date="2026-10-03T16:24:52Z">
+    <w:p>
+      <w:pPr>
+        <w:pStyle w:val="CommentText"/>
+      </w:pPr>
+      <w:r>
+        <w:rPr>
+          <w:rStyle w:val="CommentReference"/>
+        </w:rPr>
+        <w:annotationRef/>
+      </w:r>
+      <w:r>
+        <w:t>Corrección Práctica 1, criterio 2: se actualiza el título de la Tabla 10 porque ahora incluye línea base y meta cuantitativa por objetivo. El número de tabla no cambia para no alterar la numeración de los demás entregables.</w:t>
+      </w:r>
+    </w:p>
+  </w:comment>
+  <w:comment w:id="5" w:author="Jorge Chamorro" w:initials="JC" w:date="2026-10-03T16:24:52Z">
+    <w:p>
+      <w:pPr>
+        <w:pStyle w:val="CommentText"/>
+      </w:pPr>
+      <w:r>
+        <w:rPr>
+          <w:rStyle w:val="CommentReference"/>
+        </w:rPr>
+        <w:annotationRef/>
+      </w:r>
+      <w:r>
+        <w:t>Corrección Práctica 1, criterio 2: columna nueva con la línea base numérica del banco en el país para cada objetivo, como exigió el docente. Se reduce a 9 pt el tamaño de letra de la Tabla 10 para que quepan las 5 columnas en el ancho de página.</w:t>
+      </w:r>
+    </w:p>
+  </w:comment>
+  <w:comment w:id="6" w:author="Jorge Chamorro" w:initials="JC" w:date="2026-10-03T16:24:52Z">
+    <w:p>
+      <w:pPr>
+        <w:pStyle w:val="CommentText"/>
+      </w:pPr>
+      <w:r>
+        <w:rPr>
+          <w:rStyle w:val="CommentReference"/>
+        </w:rPr>
+        <w:annotationRef/>
+      </w:r>
+      <w:r>
+        <w:t>Corrección Práctica 1, criterio 2: columna nueva con la meta cuantitativa concreta por objetivo. Horizonte de 18 meses, igual al de las metas de los demás entregables.</w:t>
+      </w:r>
+    </w:p>
+  </w:comment>
+  <w:comment w:id="7" w:author="Jorge Chamorro" w:initials="JC" w:date="2026-10-03T16:24:52Z">
+    <w:p>
+      <w:pPr>
+        <w:pStyle w:val="CommentText"/>
+      </w:pPr>
+      <w:r>
+        <w:rPr>
+          <w:rStyle w:val="CommentReference"/>
+        </w:rPr>
+        <w:annotationRef/>
+      </w:r>
+      <w:r>
+        <w:t>Línea base de OE1: NPS Retail y Pyme de la Memoria anual 2025 (p. 26). Los indicadores sin dato público se declaran con la frase NO HAY FUENTES EN INTERNET DISPONIBLES en lugar de inventar cifras.</w:t>
+      </w:r>
+    </w:p>
+  </w:comment>
+  <w:comment w:id="8" w:author="Jorge Chamorro" w:initials="JC" w:date="2026-10-03T16:24:52Z">
+    <w:p>
+      <w:pPr>
+        <w:pStyle w:val="CommentText"/>
+      </w:pPr>
+      <w:r>
+        <w:rPr>
+          <w:rStyle w:val="CommentReference"/>
+        </w:rPr>
+        <w:annotationRef/>
+      </w:r>
+      <w:r>
+        <w:t>Meta de OE1: propuesta del equipo (pendiente de validación con la entidad). Se fija igualar el NPS actual de Banca de Empresas e Instituciones (43.6%), lo que reduce la brecha con Retail a la mitad (≈ 9.6 puntos). Es coherente con la operacionalización de la brecha en la sección 1.6.</w:t>
+      </w:r>
+    </w:p>
+  </w:comment>
+  <w:comment w:id="9" w:author="Jorge Chamorro" w:initials="JC" w:date="2026-10-03T16:24:52Z">
+    <w:p>
+      <w:pPr>
+        <w:pStyle w:val="CommentText"/>
+      </w:pPr>
+      <w:r>
+        <w:rPr>
+          <w:rStyle w:val="CommentReference"/>
+        </w:rPr>
+        <w:annotationRef/>
+      </w:r>
+      <w:r>
+        <w:t>Línea base de OE2: colocaciones sostenibles y cumplimiento de la meta (Memoria anual 2025) y facturación sostenible movilizada al 1S 2026 (Informe de gestión 2T 2026). Tiempo de evaluación y calidad del dato ESG no tienen dato público.</w:t>
+      </w:r>
+    </w:p>
+  </w:comment>
+  <w:comment w:id="10" w:author="Jorge Chamorro" w:initials="JC" w:date="2026-10-03T16:24:52Z">
+    <w:p>
+      <w:pPr>
+        <w:pStyle w:val="CommentText"/>
+      </w:pPr>
+      <w:r>
+        <w:rPr>
+          <w:rStyle w:val="CommentReference"/>
+        </w:rPr>
+        <w:annotationRef/>
+      </w:r>
+      <w:r>
+        <w:t>Meta de OE2: propuesta del equipo (pendiente de validación). +21% sobre S/ 16.5 mil millones ≈ S/ 20 mil millones; es conservadora frente al crecimiento de la facturación sostenible reportado (+65% en 2025).</w:t>
+      </w:r>
+    </w:p>
+  </w:comment>
+  <w:comment w:id="11" w:author="Jorge Chamorro" w:initials="JC" w:date="2026-10-03T16:24:52Z">
+    <w:p>
+      <w:pPr>
+        <w:pStyle w:val="CommentText"/>
+      </w:pPr>
+      <w:r>
+        <w:rPr>
+          <w:rStyle w:val="CommentReference"/>
+        </w:rPr>
+        <w:annotationRef/>
+      </w:r>
+      <w:r>
+        <w:t>Línea base de OE3: cuotas de mercado por segmento de la Memoria anual 2025 (p. 12) y las cuotas totales ya citadas en la sección 3. Los demás indicadores no tienen dato público.</w:t>
+      </w:r>
+    </w:p>
+  </w:comment>
+  <w:comment w:id="12" w:author="Jorge Chamorro" w:initials="JC" w:date="2026-10-03T16:24:52Z">
+    <w:p>
+      <w:pPr>
+        <w:pStyle w:val="CommentText"/>
+      </w:pPr>
+      <w:r>
+        <w:rPr>
+          <w:rStyle w:val="CommentReference"/>
+        </w:rPr>
+        <w:annotationRef/>
+      </w:r>
+      <w:r>
+        <w:t>Meta de OE3: propuesta del equipo (pendiente de validación). +0.4 puntos en colocaciones es inferior al avance de +0.62 puntos de la banca de personas en 2025; +1.0 punto en pymes es la brecha de mayor margen, dado el NPS Pyme más bajo.</w:t>
+      </w:r>
+    </w:p>
+  </w:comment>
+  <w:comment w:id="13" w:author="Jorge Chamorro" w:initials="JC" w:date="2026-10-03T16:24:52Z">
+    <w:p>
+      <w:pPr>
+        <w:pStyle w:val="CommentText"/>
+      </w:pPr>
+      <w:r>
+        <w:rPr>
+          <w:rStyle w:val="CommentReference"/>
+        </w:rPr>
+        <w:annotationRef/>
+      </w:r>
+      <w:r>
+        <w:t>Línea base de OE4: ROE, eficiencia y mora del Informe de gestión 2T 2026 y la Memoria anual 2025, comparados con el sistema. Los periodos y bases de cálculo de ambos reportes difieren (p. ej., eficiencia 35.9% vs. 40.0%), por eso se rotula el periodo. RORWA y costo de riesgo no tienen dato público.</w:t>
+      </w:r>
+    </w:p>
+  </w:comment>
+  <w:comment w:id="14" w:author="Jorge Chamorro" w:initials="JC" w:date="2026-10-03T16:24:52Z">
+    <w:p>
+      <w:pPr>
+        <w:pStyle w:val="CommentText"/>
+      </w:pPr>
+      <w:r>
+        <w:rPr>
+          <w:rStyle w:val="CommentReference"/>
+        </w:rPr>
+        <w:annotationRef/>
+      </w:r>
+      <w:r>
+        <w:t>Meta de OE4: propuesta del equipo (pendiente de validación). ROE 19.5% reduce más de la mitad la brecha de 1.4 puntos con el sistema (20.1%); eficiencia y mora se fijan como niveles a no deteriorar frente al 2T 2026.</w:t>
+      </w:r>
+    </w:p>
+  </w:comment>
+  <w:comment w:id="15" w:author="Jorge Chamorro" w:initials="JC" w:date="2026-10-03T16:24:52Z">
+    <w:p>
+      <w:pPr>
+        <w:pStyle w:val="CommentText"/>
+      </w:pPr>
+      <w:r>
+        <w:rPr>
+          <w:rStyle w:val="CommentReference"/>
+        </w:rPr>
+        <w:annotationRef/>
+      </w:r>
+      <w:r>
+        <w:t>Línea base de OE5: ventas digitales y usuarios activos de la app (Informe 2T 2026), operaciones por la app y ADA (Memoria 2025). Casos en producción y tiempo de despliegue no tienen dato público.</w:t>
+      </w:r>
+    </w:p>
+  </w:comment>
+  <w:comment w:id="16" w:author="Jorge Chamorro" w:initials="JC" w:date="2026-10-03T16:24:52Z">
+    <w:p>
+      <w:pPr>
+        <w:pStyle w:val="CommentText"/>
+      </w:pPr>
+      <w:r>
+        <w:rPr>
+          <w:rStyle w:val="CommentReference"/>
+        </w:rPr>
+        <w:annotationRef/>
+      </w:r>
+      <w:r>
+        <w:t>Meta de OE5: propuesta del equipo (pendiente de validación). 85% de ventas digitales es +5.4 puntos sobre la base de 79.57%; tres casos de IA corresponden a las tres iniciativas que se priorizarán en los siguientes entregables.</w:t>
+      </w:r>
+    </w:p>
+  </w:comment>
+  <w:comment w:id="17" w:author="Jorge Chamorro" w:initials="JC" w:date="2026-10-03T16:24:52Z">
+    <w:p>
+      <w:pPr>
+        <w:pStyle w:val="CommentText"/>
+      </w:pPr>
+      <w:r>
+        <w:rPr>
+          <w:rStyle w:val="CommentReference"/>
+        </w:rPr>
+        <w:annotationRef/>
+      </w:r>
+      <w:r>
+        <w:t>Línea base de OE6: índice de compromiso (Memoria 2025, p. 12) y adopción interna de Blue Buddy (Informe 2T 2026). Productividad y automatizaciones no tienen dato público.</w:t>
+      </w:r>
+    </w:p>
+  </w:comment>
+  <w:comment w:id="18" w:author="Jorge Chamorro" w:initials="JC" w:date="2026-10-03T16:24:52Z">
+    <w:p>
+      <w:pPr>
+        <w:pStyle w:val="CommentText"/>
+      </w:pPr>
+      <w:r>
+        <w:rPr>
+          <w:rStyle w:val="CommentReference"/>
+        </w:rPr>
+        <w:annotationRef/>
+      </w:r>
+      <w:r>
+        <w:t>Meta de OE6: propuesta del equipo (pendiente de validación). Se busca sostener el compromiso de 93/100 y elevar la adopción interna de Blue Buddy de 90% a 95%.</w:t>
+      </w:r>
+    </w:p>
+  </w:comment>
+  <w:comment w:id="19" w:author="Jorge Chamorro" w:initials="JC" w:date="2026-10-03T16:24:52Z">
+    <w:p>
+      <w:pPr>
+        <w:pStyle w:val="CommentText"/>
+      </w:pPr>
+      <w:r>
+        <w:rPr>
+          <w:rStyle w:val="CommentReference"/>
+        </w:rPr>
+        <w:annotationRef/>
+      </w:r>
+      <w:r>
+        <w:t>Corrección Práctica 1, criterios 2 y 4: la nota ahora declara las fuentes de las líneas base, el carácter propuesto de las metas y el significado de NO HAY FUENTES EN INTERNET DISPONIBLES, para que la tabla se pueda sustentar y verificar.</w:t>
+      </w:r>
+    </w:p>
+  </w:comment>
+  <w:comment w:id="20" w:author="Jorge Chamorro" w:initials="JC" w:date="2026-10-03T16:24:52Z">
+    <w:p>
+      <w:pPr>
+        <w:pStyle w:val="CommentText"/>
+      </w:pPr>
+      <w:r>
+        <w:rPr>
+          <w:rStyle w:val="CommentReference"/>
+        </w:rPr>
+        <w:annotationRef/>
+      </w:r>
+      <w:r>
+        <w:t>Corrección Práctica 1, criterio 3 (Procesos críticos, 1/2): el docente señaló que la criticidad atendía sobre todo al OE5 y a la resiliencia de canales, sin cobertura explícita de OE2 y OE4, y que debe cubrir la totalidad de los objetivos. Esta oración fija ese criterio de cobertura.</w:t>
+      </w:r>
+    </w:p>
+  </w:comment>
+  <w:comment w:id="21" w:author="Jorge Chamorro" w:initials="JC" w:date="2026-10-03T16:24:52Z">
+    <w:p>
+      <w:pPr>
+        <w:pStyle w:val="CommentText"/>
+      </w:pPr>
+      <w:r>
+        <w:rPr>
+          <w:rStyle w:val="CommentReference"/>
+        </w:rPr>
+        <w:annotationRef/>
+      </w:r>
+      <w:r>
+        <w:t>Corrección Práctica 1, criterio 3: columna nueva de trazabilidad entre cada macroproceso crítico y los objetivos estratégicos de la Tabla 10. Se reduce a 9 pt el tamaño de letra de la Tabla 12 para acomodar la columna.</w:t>
+      </w:r>
+    </w:p>
+  </w:comment>
+  <w:comment w:id="22" w:author="Jorge Chamorro" w:initials="JC" w:date="2026-10-03T16:24:52Z">
+    <w:p>
+      <w:pPr>
+        <w:pStyle w:val="CommentText"/>
+      </w:pPr>
+      <w:r>
+        <w:rPr>
+          <w:rStyle w:val="CommentReference"/>
+        </w:rPr>
+        <w:annotationRef/>
+      </w:r>
+      <w:r>
+        <w:t>Trazabilidad de Operación de canales: se explicita su aporte a OE1 (experiencia y NPS), OE3 (soluciones transaccionales para empresas) y OE4 (eficiencia por volumen), además de la resiliencia ya justificada. Evita que la criticidad se lea solo como resiliencia de canales, observación del docente.</w:t>
+      </w:r>
+    </w:p>
+  </w:comment>
+  <w:comment w:id="23" w:author="Jorge Chamorro" w:initials="JC" w:date="2026-10-03T16:24:52Z">
+    <w:p>
+      <w:pPr>
+        <w:pStyle w:val="CommentText"/>
+      </w:pPr>
+      <w:r>
+        <w:rPr>
+          <w:rStyle w:val="CommentReference"/>
+        </w:rPr>
+        <w:annotationRef/>
+      </w:r>
+      <w:r>
+        <w:t>Trazabilidad de Datos, analítica e IA: además de OE5 se explicita OE2 (taxonomía, trazabilidad y datos ESG, capacidades listadas en la Tabla 10) y OE4 (rentabilidad granular, pricing y modelos de riesgo), los dos objetivos sin cobertura señalados por el docente; también OE6 (calidad de datos y automatizaciones).</w:t>
+      </w:r>
+    </w:p>
+  </w:comment>
+  <w:comment w:id="24" w:author="Jorge Chamorro" w:initials="JC" w:date="2026-10-03T16:24:52Z">
+    <w:p>
+      <w:pPr>
+        <w:pStyle w:val="CommentText"/>
+      </w:pPr>
+      <w:r>
+        <w:rPr>
+          <w:rStyle w:val="CommentReference"/>
+        </w:rPr>
+        <w:annotationRef/>
+      </w:r>
+      <w:r>
+        <w:t>Trazabilidad de Seguridad: se explicita su rol de habilitador transversal y su vínculo con OE1, OE2 y OE5, para que la criticidad no dependa solo del régimen normativo.</w:t>
+      </w:r>
+    </w:p>
+  </w:comment>
+  <w:comment w:id="25" w:author="Jorge Chamorro" w:initials="JC" w:date="2026-10-03T16:24:52Z">
+    <w:p>
+      <w:pPr>
+        <w:pStyle w:val="CommentText"/>
+      </w:pPr>
+      <w:r>
+        <w:rPr>
+          <w:rStyle w:val="CommentReference"/>
+        </w:rPr>
+        <w:annotationRef/>
+      </w:r>
+      <w:r>
+        <w:t>Corrección Práctica 1, criterio 3: la nota resume la cobertura de OE1 a OE6 por los macroprocesos críticos, para que la trazabilidad exigida por el docente sea verificable de un vistazo.</w:t>
       </w:r>
     </w:p>
   </w:comment>

</xml_diff>